<commit_message>
Update meeting minutes and Road Rush game
</commit_message>
<xml_diff>
--- a/Meetings/Meeting1/First Team Meeting.docx
+++ b/Meetings/Meeting1/First Team Meeting.docx
@@ -4,40 +4,46 @@
   <w:body>
     <w:p>
       <w:pPr>
+        <w:spacing w:after="120" w:line="259" w:lineRule="auto"/>
         <w:jc w:val="center"/>
       </w:pPr>
       <w:r>
         <w:rPr>
           <w:rFonts w:ascii="Arial" w:hAnsi="Arial"/>
           <w:b/>
+          <w:color w:val="1F4E79"/>
           <w:sz w:val="36"/>
         </w:rPr>
-        <w:t>Team Meeting Minutes</w:t>
+        <w:t>Academic Minutes of Meeting 1</w:t>
       </w:r>
     </w:p>
     <w:p>
       <w:pPr>
+        <w:spacing w:after="120" w:line="259" w:lineRule="auto"/>
         <w:jc w:val="center"/>
       </w:pPr>
       <w:r>
         <w:rPr>
           <w:rFonts w:ascii="Arial" w:hAnsi="Arial"/>
           <w:i/>
-          <w:sz w:val="22"/>
+          <w:sz w:val="21"/>
         </w:rPr>
-        <w:t>503IT Communication and Collaboration - Collaborative Solution Development</w:t>
+        <w:t>503IT Communication and Collaboration - Collaborative Solution Development and Professional Reflection</w:t>
       </w:r>
     </w:p>
-    <w:p/>
     <w:p>
       <w:pPr>
         <w:pStyle w:val="Heading1"/>
+        <w:spacing w:after="80" w:line="259" w:lineRule="auto" w:before="160"/>
       </w:pPr>
       <w:r>
         <w:rPr>
           <w:rFonts w:ascii="Arial" w:hAnsi="Arial"/>
+          <w:b/>
+          <w:color w:val="1F4E79"/>
+          <w:sz w:val="26"/>
         </w:rPr>
-        <w:t>Meeting Details</w:t>
+        <w:t>1. Meeting Details</w:t>
       </w:r>
     </w:p>
     <w:tbl>
@@ -45,29 +51,48 @@
         <w:tblStyle w:val="TableGrid"/>
         <w:tblW w:type="auto" w:w="0"/>
         <w:jc w:val="center"/>
+        <w:tblLayout w:type="autofit"/>
         <w:tblLook w:firstColumn="1" w:firstRow="1" w:lastColumn="0" w:lastRow="0" w:noHBand="0" w:noVBand="1" w:val="04A0"/>
       </w:tblPr>
       <w:tblGrid>
-        <w:gridCol w:w="4968"/>
-        <w:gridCol w:w="4968"/>
+        <w:gridCol w:w="5040"/>
+        <w:gridCol w:w="5040"/>
       </w:tblGrid>
       <w:tr>
+        <w:trPr>
+          <w:tblHeader w:val="true"/>
+        </w:trPr>
         <w:tc>
           <w:tcPr>
             <w:tcW w:type="dxa" w:w="2592"/>
             <w:vAlign w:val="center"/>
             <w:shd w:fill="D9EAF7"/>
+            <w:tcBorders>
+              <w:top w:val="single" w:sz="6" w:space="0" w:color="A6A6A6"/>
+              <w:left w:val="single" w:sz="6" w:space="0" w:color="A6A6A6"/>
+              <w:bottom w:val="single" w:sz="6" w:space="0" w:color="A6A6A6"/>
+              <w:right w:val="single" w:sz="6" w:space="0" w:color="A6A6A6"/>
+              <w:insideH w:val="single" w:sz="6" w:space="0" w:color="A6A6A6"/>
+              <w:insideV w:val="single" w:sz="6" w:space="0" w:color="A6A6A6"/>
+            </w:tcBorders>
           </w:tcPr>
           <w:p>
             <w:pPr>
+              <w:spacing w:after="0" w:line="240" w:lineRule="auto"/>
               <w:jc w:val="left"/>
             </w:pPr>
-            <w:r/>
             <w:r>
               <w:rPr>
                 <w:rFonts w:ascii="Arial" w:hAnsi="Arial"/>
                 <w:b/>
-                <w:sz w:val="20"/>
+                <w:sz w:val="19"/>
+              </w:rPr>
+            </w:r>
+            <w:r>
+              <w:rPr>
+                <w:rFonts w:ascii="Arial" w:hAnsi="Arial"/>
+                <w:b/>
+                <w:sz w:val="19"/>
               </w:rPr>
               <w:t>Item</w:t>
             </w:r>
@@ -75,20 +100,35 @@
         </w:tc>
         <w:tc>
           <w:tcPr>
-            <w:tcW w:type="dxa" w:w="7920"/>
+            <w:tcW w:type="dxa" w:w="8064"/>
             <w:vAlign w:val="center"/>
             <w:shd w:fill="D9EAF7"/>
+            <w:tcBorders>
+              <w:top w:val="single" w:sz="6" w:space="0" w:color="A6A6A6"/>
+              <w:left w:val="single" w:sz="6" w:space="0" w:color="A6A6A6"/>
+              <w:bottom w:val="single" w:sz="6" w:space="0" w:color="A6A6A6"/>
+              <w:right w:val="single" w:sz="6" w:space="0" w:color="A6A6A6"/>
+              <w:insideH w:val="single" w:sz="6" w:space="0" w:color="A6A6A6"/>
+              <w:insideV w:val="single" w:sz="6" w:space="0" w:color="A6A6A6"/>
+            </w:tcBorders>
           </w:tcPr>
           <w:p>
             <w:pPr>
+              <w:spacing w:after="0" w:line="240" w:lineRule="auto"/>
               <w:jc w:val="left"/>
             </w:pPr>
-            <w:r/>
             <w:r>
               <w:rPr>
                 <w:rFonts w:ascii="Arial" w:hAnsi="Arial"/>
                 <w:b/>
-                <w:sz w:val="20"/>
+                <w:sz w:val="19"/>
+              </w:rPr>
+            </w:r>
+            <w:r>
+              <w:rPr>
+                <w:rFonts w:ascii="Arial" w:hAnsi="Arial"/>
+                <w:b/>
+                <w:sz w:val="19"/>
               </w:rPr>
               <w:t>Details</w:t>
             </w:r>
@@ -100,17 +140,31 @@
           <w:tcPr>
             <w:tcW w:type="dxa" w:w="2592"/>
             <w:vAlign w:val="center"/>
+            <w:tcBorders>
+              <w:top w:val="single" w:sz="6" w:space="0" w:color="A6A6A6"/>
+              <w:left w:val="single" w:sz="6" w:space="0" w:color="A6A6A6"/>
+              <w:bottom w:val="single" w:sz="6" w:space="0" w:color="A6A6A6"/>
+              <w:right w:val="single" w:sz="6" w:space="0" w:color="A6A6A6"/>
+              <w:insideH w:val="single" w:sz="6" w:space="0" w:color="A6A6A6"/>
+              <w:insideV w:val="single" w:sz="6" w:space="0" w:color="A6A6A6"/>
+            </w:tcBorders>
           </w:tcPr>
           <w:p>
             <w:pPr>
+              <w:spacing w:after="0" w:line="240" w:lineRule="auto"/>
               <w:jc w:val="left"/>
             </w:pPr>
-            <w:r/>
+            <w:r>
+              <w:rPr>
+                <w:rFonts w:ascii="Arial" w:hAnsi="Arial"/>
+                <w:sz w:val="19"/>
+              </w:rPr>
+            </w:r>
             <w:r>
               <w:rPr>
                 <w:rFonts w:ascii="Arial" w:hAnsi="Arial"/>
                 <w:b w:val="0"/>
-                <w:sz w:val="20"/>
+                <w:sz w:val="19"/>
               </w:rPr>
               <w:t>Meeting number</w:t>
             </w:r>
@@ -118,19 +172,33 @@
         </w:tc>
         <w:tc>
           <w:tcPr>
-            <w:tcW w:type="dxa" w:w="7920"/>
+            <w:tcW w:type="dxa" w:w="8064"/>
             <w:vAlign w:val="center"/>
+            <w:tcBorders>
+              <w:top w:val="single" w:sz="6" w:space="0" w:color="A6A6A6"/>
+              <w:left w:val="single" w:sz="6" w:space="0" w:color="A6A6A6"/>
+              <w:bottom w:val="single" w:sz="6" w:space="0" w:color="A6A6A6"/>
+              <w:right w:val="single" w:sz="6" w:space="0" w:color="A6A6A6"/>
+              <w:insideH w:val="single" w:sz="6" w:space="0" w:color="A6A6A6"/>
+              <w:insideV w:val="single" w:sz="6" w:space="0" w:color="A6A6A6"/>
+            </w:tcBorders>
           </w:tcPr>
           <w:p>
             <w:pPr>
+              <w:spacing w:after="0" w:line="240" w:lineRule="auto"/>
               <w:jc w:val="left"/>
             </w:pPr>
-            <w:r/>
+            <w:r>
+              <w:rPr>
+                <w:rFonts w:ascii="Arial" w:hAnsi="Arial"/>
+                <w:sz w:val="19"/>
+              </w:rPr>
+            </w:r>
             <w:r>
               <w:rPr>
                 <w:rFonts w:ascii="Arial" w:hAnsi="Arial"/>
                 <w:b w:val="0"/>
-                <w:sz w:val="20"/>
+                <w:sz w:val="19"/>
               </w:rPr>
               <w:t>Meeting 1</w:t>
             </w:r>
@@ -142,17 +210,31 @@
           <w:tcPr>
             <w:tcW w:type="dxa" w:w="2592"/>
             <w:vAlign w:val="center"/>
+            <w:tcBorders>
+              <w:top w:val="single" w:sz="6" w:space="0" w:color="A6A6A6"/>
+              <w:left w:val="single" w:sz="6" w:space="0" w:color="A6A6A6"/>
+              <w:bottom w:val="single" w:sz="6" w:space="0" w:color="A6A6A6"/>
+              <w:right w:val="single" w:sz="6" w:space="0" w:color="A6A6A6"/>
+              <w:insideH w:val="single" w:sz="6" w:space="0" w:color="A6A6A6"/>
+              <w:insideV w:val="single" w:sz="6" w:space="0" w:color="A6A6A6"/>
+            </w:tcBorders>
           </w:tcPr>
           <w:p>
             <w:pPr>
+              <w:spacing w:after="0" w:line="240" w:lineRule="auto"/>
               <w:jc w:val="left"/>
             </w:pPr>
-            <w:r/>
+            <w:r>
+              <w:rPr>
+                <w:rFonts w:ascii="Arial" w:hAnsi="Arial"/>
+                <w:sz w:val="19"/>
+              </w:rPr>
+            </w:r>
             <w:r>
               <w:rPr>
                 <w:rFonts w:ascii="Arial" w:hAnsi="Arial"/>
                 <w:b w:val="0"/>
-                <w:sz w:val="20"/>
+                <w:sz w:val="19"/>
               </w:rPr>
               <w:t>Date</w:t>
             </w:r>
@@ -160,19 +242,33 @@
         </w:tc>
         <w:tc>
           <w:tcPr>
-            <w:tcW w:type="dxa" w:w="7920"/>
+            <w:tcW w:type="dxa" w:w="8064"/>
             <w:vAlign w:val="center"/>
+            <w:tcBorders>
+              <w:top w:val="single" w:sz="6" w:space="0" w:color="A6A6A6"/>
+              <w:left w:val="single" w:sz="6" w:space="0" w:color="A6A6A6"/>
+              <w:bottom w:val="single" w:sz="6" w:space="0" w:color="A6A6A6"/>
+              <w:right w:val="single" w:sz="6" w:space="0" w:color="A6A6A6"/>
+              <w:insideH w:val="single" w:sz="6" w:space="0" w:color="A6A6A6"/>
+              <w:insideV w:val="single" w:sz="6" w:space="0" w:color="A6A6A6"/>
+            </w:tcBorders>
           </w:tcPr>
           <w:p>
             <w:pPr>
+              <w:spacing w:after="0" w:line="240" w:lineRule="auto"/>
               <w:jc w:val="left"/>
             </w:pPr>
-            <w:r/>
+            <w:r>
+              <w:rPr>
+                <w:rFonts w:ascii="Arial" w:hAnsi="Arial"/>
+                <w:sz w:val="19"/>
+              </w:rPr>
+            </w:r>
             <w:r>
               <w:rPr>
                 <w:rFonts w:ascii="Arial" w:hAnsi="Arial"/>
                 <w:b w:val="0"/>
-                <w:sz w:val="20"/>
+                <w:sz w:val="19"/>
               </w:rPr>
               <w:t>19/05/2026</w:t>
             </w:r>
@@ -184,17 +280,31 @@
           <w:tcPr>
             <w:tcW w:type="dxa" w:w="2592"/>
             <w:vAlign w:val="center"/>
+            <w:tcBorders>
+              <w:top w:val="single" w:sz="6" w:space="0" w:color="A6A6A6"/>
+              <w:left w:val="single" w:sz="6" w:space="0" w:color="A6A6A6"/>
+              <w:bottom w:val="single" w:sz="6" w:space="0" w:color="A6A6A6"/>
+              <w:right w:val="single" w:sz="6" w:space="0" w:color="A6A6A6"/>
+              <w:insideH w:val="single" w:sz="6" w:space="0" w:color="A6A6A6"/>
+              <w:insideV w:val="single" w:sz="6" w:space="0" w:color="A6A6A6"/>
+            </w:tcBorders>
           </w:tcPr>
           <w:p>
             <w:pPr>
+              <w:spacing w:after="0" w:line="240" w:lineRule="auto"/>
               <w:jc w:val="left"/>
             </w:pPr>
-            <w:r/>
+            <w:r>
+              <w:rPr>
+                <w:rFonts w:ascii="Arial" w:hAnsi="Arial"/>
+                <w:sz w:val="19"/>
+              </w:rPr>
+            </w:r>
             <w:r>
               <w:rPr>
                 <w:rFonts w:ascii="Arial" w:hAnsi="Arial"/>
                 <w:b w:val="0"/>
-                <w:sz w:val="20"/>
+                <w:sz w:val="19"/>
               </w:rPr>
               <w:t>Time</w:t>
             </w:r>
@@ -202,19 +312,33 @@
         </w:tc>
         <w:tc>
           <w:tcPr>
-            <w:tcW w:type="dxa" w:w="7920"/>
+            <w:tcW w:type="dxa" w:w="8064"/>
             <w:vAlign w:val="center"/>
+            <w:tcBorders>
+              <w:top w:val="single" w:sz="6" w:space="0" w:color="A6A6A6"/>
+              <w:left w:val="single" w:sz="6" w:space="0" w:color="A6A6A6"/>
+              <w:bottom w:val="single" w:sz="6" w:space="0" w:color="A6A6A6"/>
+              <w:right w:val="single" w:sz="6" w:space="0" w:color="A6A6A6"/>
+              <w:insideH w:val="single" w:sz="6" w:space="0" w:color="A6A6A6"/>
+              <w:insideV w:val="single" w:sz="6" w:space="0" w:color="A6A6A6"/>
+            </w:tcBorders>
           </w:tcPr>
           <w:p>
             <w:pPr>
+              <w:spacing w:after="0" w:line="240" w:lineRule="auto"/>
               <w:jc w:val="left"/>
             </w:pPr>
-            <w:r/>
+            <w:r>
+              <w:rPr>
+                <w:rFonts w:ascii="Arial" w:hAnsi="Arial"/>
+                <w:sz w:val="19"/>
+              </w:rPr>
+            </w:r>
             <w:r>
               <w:rPr>
                 <w:rFonts w:ascii="Arial" w:hAnsi="Arial"/>
                 <w:b w:val="0"/>
-                <w:sz w:val="20"/>
+                <w:sz w:val="19"/>
               </w:rPr>
               <w:t>4:00 PM</w:t>
             </w:r>
@@ -226,17 +350,31 @@
           <w:tcPr>
             <w:tcW w:type="dxa" w:w="2592"/>
             <w:vAlign w:val="center"/>
+            <w:tcBorders>
+              <w:top w:val="single" w:sz="6" w:space="0" w:color="A6A6A6"/>
+              <w:left w:val="single" w:sz="6" w:space="0" w:color="A6A6A6"/>
+              <w:bottom w:val="single" w:sz="6" w:space="0" w:color="A6A6A6"/>
+              <w:right w:val="single" w:sz="6" w:space="0" w:color="A6A6A6"/>
+              <w:insideH w:val="single" w:sz="6" w:space="0" w:color="A6A6A6"/>
+              <w:insideV w:val="single" w:sz="6" w:space="0" w:color="A6A6A6"/>
+            </w:tcBorders>
           </w:tcPr>
           <w:p>
             <w:pPr>
+              <w:spacing w:after="0" w:line="240" w:lineRule="auto"/>
               <w:jc w:val="left"/>
             </w:pPr>
-            <w:r/>
+            <w:r>
+              <w:rPr>
+                <w:rFonts w:ascii="Arial" w:hAnsi="Arial"/>
+                <w:sz w:val="19"/>
+              </w:rPr>
+            </w:r>
             <w:r>
               <w:rPr>
                 <w:rFonts w:ascii="Arial" w:hAnsi="Arial"/>
                 <w:b w:val="0"/>
-                <w:sz w:val="20"/>
+                <w:sz w:val="19"/>
               </w:rPr>
               <w:t>Location / platform</w:t>
             </w:r>
@@ -244,19 +382,33 @@
         </w:tc>
         <w:tc>
           <w:tcPr>
-            <w:tcW w:type="dxa" w:w="7920"/>
+            <w:tcW w:type="dxa" w:w="8064"/>
             <w:vAlign w:val="center"/>
+            <w:tcBorders>
+              <w:top w:val="single" w:sz="6" w:space="0" w:color="A6A6A6"/>
+              <w:left w:val="single" w:sz="6" w:space="0" w:color="A6A6A6"/>
+              <w:bottom w:val="single" w:sz="6" w:space="0" w:color="A6A6A6"/>
+              <w:right w:val="single" w:sz="6" w:space="0" w:color="A6A6A6"/>
+              <w:insideH w:val="single" w:sz="6" w:space="0" w:color="A6A6A6"/>
+              <w:insideV w:val="single" w:sz="6" w:space="0" w:color="A6A6A6"/>
+            </w:tcBorders>
           </w:tcPr>
           <w:p>
             <w:pPr>
+              <w:spacing w:after="0" w:line="240" w:lineRule="auto"/>
               <w:jc w:val="left"/>
             </w:pPr>
-            <w:r/>
+            <w:r>
+              <w:rPr>
+                <w:rFonts w:ascii="Arial" w:hAnsi="Arial"/>
+                <w:sz w:val="19"/>
+              </w:rPr>
+            </w:r>
             <w:r>
               <w:rPr>
                 <w:rFonts w:ascii="Arial" w:hAnsi="Arial"/>
                 <w:b w:val="0"/>
-                <w:sz w:val="20"/>
+                <w:sz w:val="19"/>
               </w:rPr>
               <w:t>CU London University - in-person meeting</w:t>
             </w:r>
@@ -268,17 +420,31 @@
           <w:tcPr>
             <w:tcW w:type="dxa" w:w="2592"/>
             <w:vAlign w:val="center"/>
+            <w:tcBorders>
+              <w:top w:val="single" w:sz="6" w:space="0" w:color="A6A6A6"/>
+              <w:left w:val="single" w:sz="6" w:space="0" w:color="A6A6A6"/>
+              <w:bottom w:val="single" w:sz="6" w:space="0" w:color="A6A6A6"/>
+              <w:right w:val="single" w:sz="6" w:space="0" w:color="A6A6A6"/>
+              <w:insideH w:val="single" w:sz="6" w:space="0" w:color="A6A6A6"/>
+              <w:insideV w:val="single" w:sz="6" w:space="0" w:color="A6A6A6"/>
+            </w:tcBorders>
           </w:tcPr>
           <w:p>
             <w:pPr>
+              <w:spacing w:after="0" w:line="240" w:lineRule="auto"/>
               <w:jc w:val="left"/>
             </w:pPr>
-            <w:r/>
+            <w:r>
+              <w:rPr>
+                <w:rFonts w:ascii="Arial" w:hAnsi="Arial"/>
+                <w:sz w:val="19"/>
+              </w:rPr>
+            </w:r>
             <w:r>
               <w:rPr>
                 <w:rFonts w:ascii="Arial" w:hAnsi="Arial"/>
                 <w:b w:val="0"/>
-                <w:sz w:val="20"/>
+                <w:sz w:val="19"/>
               </w:rPr>
               <w:t>Chair</w:t>
             </w:r>
@@ -286,19 +452,33 @@
         </w:tc>
         <w:tc>
           <w:tcPr>
-            <w:tcW w:type="dxa" w:w="7920"/>
+            <w:tcW w:type="dxa" w:w="8064"/>
             <w:vAlign w:val="center"/>
+            <w:tcBorders>
+              <w:top w:val="single" w:sz="6" w:space="0" w:color="A6A6A6"/>
+              <w:left w:val="single" w:sz="6" w:space="0" w:color="A6A6A6"/>
+              <w:bottom w:val="single" w:sz="6" w:space="0" w:color="A6A6A6"/>
+              <w:right w:val="single" w:sz="6" w:space="0" w:color="A6A6A6"/>
+              <w:insideH w:val="single" w:sz="6" w:space="0" w:color="A6A6A6"/>
+              <w:insideV w:val="single" w:sz="6" w:space="0" w:color="A6A6A6"/>
+            </w:tcBorders>
           </w:tcPr>
           <w:p>
             <w:pPr>
+              <w:spacing w:after="0" w:line="240" w:lineRule="auto"/>
               <w:jc w:val="left"/>
             </w:pPr>
-            <w:r/>
+            <w:r>
+              <w:rPr>
+                <w:rFonts w:ascii="Arial" w:hAnsi="Arial"/>
+                <w:sz w:val="19"/>
+              </w:rPr>
+            </w:r>
             <w:r>
               <w:rPr>
                 <w:rFonts w:ascii="Arial" w:hAnsi="Arial"/>
                 <w:b w:val="0"/>
-                <w:sz w:val="20"/>
+                <w:sz w:val="19"/>
               </w:rPr>
               <w:t>Sabina Mahat</w:t>
             </w:r>
@@ -310,17 +490,31 @@
           <w:tcPr>
             <w:tcW w:type="dxa" w:w="2592"/>
             <w:vAlign w:val="center"/>
+            <w:tcBorders>
+              <w:top w:val="single" w:sz="6" w:space="0" w:color="A6A6A6"/>
+              <w:left w:val="single" w:sz="6" w:space="0" w:color="A6A6A6"/>
+              <w:bottom w:val="single" w:sz="6" w:space="0" w:color="A6A6A6"/>
+              <w:right w:val="single" w:sz="6" w:space="0" w:color="A6A6A6"/>
+              <w:insideH w:val="single" w:sz="6" w:space="0" w:color="A6A6A6"/>
+              <w:insideV w:val="single" w:sz="6" w:space="0" w:color="A6A6A6"/>
+            </w:tcBorders>
           </w:tcPr>
           <w:p>
             <w:pPr>
+              <w:spacing w:after="0" w:line="240" w:lineRule="auto"/>
               <w:jc w:val="left"/>
             </w:pPr>
-            <w:r/>
+            <w:r>
+              <w:rPr>
+                <w:rFonts w:ascii="Arial" w:hAnsi="Arial"/>
+                <w:sz w:val="19"/>
+              </w:rPr>
+            </w:r>
             <w:r>
               <w:rPr>
                 <w:rFonts w:ascii="Arial" w:hAnsi="Arial"/>
                 <w:b w:val="0"/>
-                <w:sz w:val="20"/>
+                <w:sz w:val="19"/>
               </w:rPr>
               <w:t>Minute-taker</w:t>
             </w:r>
@@ -328,19 +522,33 @@
         </w:tc>
         <w:tc>
           <w:tcPr>
-            <w:tcW w:type="dxa" w:w="7920"/>
+            <w:tcW w:type="dxa" w:w="8064"/>
             <w:vAlign w:val="center"/>
+            <w:tcBorders>
+              <w:top w:val="single" w:sz="6" w:space="0" w:color="A6A6A6"/>
+              <w:left w:val="single" w:sz="6" w:space="0" w:color="A6A6A6"/>
+              <w:bottom w:val="single" w:sz="6" w:space="0" w:color="A6A6A6"/>
+              <w:right w:val="single" w:sz="6" w:space="0" w:color="A6A6A6"/>
+              <w:insideH w:val="single" w:sz="6" w:space="0" w:color="A6A6A6"/>
+              <w:insideV w:val="single" w:sz="6" w:space="0" w:color="A6A6A6"/>
+            </w:tcBorders>
           </w:tcPr>
           <w:p>
             <w:pPr>
+              <w:spacing w:after="0" w:line="240" w:lineRule="auto"/>
               <w:jc w:val="left"/>
             </w:pPr>
-            <w:r/>
+            <w:r>
+              <w:rPr>
+                <w:rFonts w:ascii="Arial" w:hAnsi="Arial"/>
+                <w:sz w:val="19"/>
+              </w:rPr>
+            </w:r>
             <w:r>
               <w:rPr>
                 <w:rFonts w:ascii="Arial" w:hAnsi="Arial"/>
                 <w:b w:val="0"/>
-                <w:sz w:val="20"/>
+                <w:sz w:val="19"/>
               </w:rPr>
               <w:t>Renita V Kapdiya</w:t>
             </w:r>
@@ -352,17 +560,31 @@
           <w:tcPr>
             <w:tcW w:type="dxa" w:w="2592"/>
             <w:vAlign w:val="center"/>
+            <w:tcBorders>
+              <w:top w:val="single" w:sz="6" w:space="0" w:color="A6A6A6"/>
+              <w:left w:val="single" w:sz="6" w:space="0" w:color="A6A6A6"/>
+              <w:bottom w:val="single" w:sz="6" w:space="0" w:color="A6A6A6"/>
+              <w:right w:val="single" w:sz="6" w:space="0" w:color="A6A6A6"/>
+              <w:insideH w:val="single" w:sz="6" w:space="0" w:color="A6A6A6"/>
+              <w:insideV w:val="single" w:sz="6" w:space="0" w:color="A6A6A6"/>
+            </w:tcBorders>
           </w:tcPr>
           <w:p>
             <w:pPr>
+              <w:spacing w:after="0" w:line="240" w:lineRule="auto"/>
               <w:jc w:val="left"/>
             </w:pPr>
-            <w:r/>
+            <w:r>
+              <w:rPr>
+                <w:rFonts w:ascii="Arial" w:hAnsi="Arial"/>
+                <w:sz w:val="19"/>
+              </w:rPr>
+            </w:r>
             <w:r>
               <w:rPr>
                 <w:rFonts w:ascii="Arial" w:hAnsi="Arial"/>
                 <w:b w:val="0"/>
-                <w:sz w:val="20"/>
+                <w:sz w:val="19"/>
               </w:rPr>
               <w:t>Attendees</w:t>
             </w:r>
@@ -370,19 +592,33 @@
         </w:tc>
         <w:tc>
           <w:tcPr>
-            <w:tcW w:type="dxa" w:w="7920"/>
+            <w:tcW w:type="dxa" w:w="8064"/>
             <w:vAlign w:val="center"/>
+            <w:tcBorders>
+              <w:top w:val="single" w:sz="6" w:space="0" w:color="A6A6A6"/>
+              <w:left w:val="single" w:sz="6" w:space="0" w:color="A6A6A6"/>
+              <w:bottom w:val="single" w:sz="6" w:space="0" w:color="A6A6A6"/>
+              <w:right w:val="single" w:sz="6" w:space="0" w:color="A6A6A6"/>
+              <w:insideH w:val="single" w:sz="6" w:space="0" w:color="A6A6A6"/>
+              <w:insideV w:val="single" w:sz="6" w:space="0" w:color="A6A6A6"/>
+            </w:tcBorders>
           </w:tcPr>
           <w:p>
             <w:pPr>
+              <w:spacing w:after="0" w:line="240" w:lineRule="auto"/>
               <w:jc w:val="left"/>
             </w:pPr>
-            <w:r/>
+            <w:r>
+              <w:rPr>
+                <w:rFonts w:ascii="Arial" w:hAnsi="Arial"/>
+                <w:sz w:val="19"/>
+              </w:rPr>
+            </w:r>
             <w:r>
               <w:rPr>
                 <w:rFonts w:ascii="Arial" w:hAnsi="Arial"/>
                 <w:b w:val="0"/>
-                <w:sz w:val="20"/>
+                <w:sz w:val="19"/>
               </w:rPr>
               <w:t>Anjila Gurung, Renita V Kapdiya, Richa Sorathiya, Sabina Mahat, Kaberi Shrestha</w:t>
             </w:r>
@@ -394,17 +630,31 @@
           <w:tcPr>
             <w:tcW w:type="dxa" w:w="2592"/>
             <w:vAlign w:val="center"/>
+            <w:tcBorders>
+              <w:top w:val="single" w:sz="6" w:space="0" w:color="A6A6A6"/>
+              <w:left w:val="single" w:sz="6" w:space="0" w:color="A6A6A6"/>
+              <w:bottom w:val="single" w:sz="6" w:space="0" w:color="A6A6A6"/>
+              <w:right w:val="single" w:sz="6" w:space="0" w:color="A6A6A6"/>
+              <w:insideH w:val="single" w:sz="6" w:space="0" w:color="A6A6A6"/>
+              <w:insideV w:val="single" w:sz="6" w:space="0" w:color="A6A6A6"/>
+            </w:tcBorders>
           </w:tcPr>
           <w:p>
             <w:pPr>
+              <w:spacing w:after="0" w:line="240" w:lineRule="auto"/>
               <w:jc w:val="left"/>
             </w:pPr>
-            <w:r/>
+            <w:r>
+              <w:rPr>
+                <w:rFonts w:ascii="Arial" w:hAnsi="Arial"/>
+                <w:sz w:val="19"/>
+              </w:rPr>
+            </w:r>
             <w:r>
               <w:rPr>
                 <w:rFonts w:ascii="Arial" w:hAnsi="Arial"/>
                 <w:b w:val="0"/>
-                <w:sz w:val="20"/>
+                <w:sz w:val="19"/>
               </w:rPr>
               <w:t>Apologies</w:t>
             </w:r>
@@ -412,19 +662,33 @@
         </w:tc>
         <w:tc>
           <w:tcPr>
-            <w:tcW w:type="dxa" w:w="7920"/>
+            <w:tcW w:type="dxa" w:w="8064"/>
             <w:vAlign w:val="center"/>
+            <w:tcBorders>
+              <w:top w:val="single" w:sz="6" w:space="0" w:color="A6A6A6"/>
+              <w:left w:val="single" w:sz="6" w:space="0" w:color="A6A6A6"/>
+              <w:bottom w:val="single" w:sz="6" w:space="0" w:color="A6A6A6"/>
+              <w:right w:val="single" w:sz="6" w:space="0" w:color="A6A6A6"/>
+              <w:insideH w:val="single" w:sz="6" w:space="0" w:color="A6A6A6"/>
+              <w:insideV w:val="single" w:sz="6" w:space="0" w:color="A6A6A6"/>
+            </w:tcBorders>
           </w:tcPr>
           <w:p>
             <w:pPr>
+              <w:spacing w:after="0" w:line="240" w:lineRule="auto"/>
               <w:jc w:val="left"/>
             </w:pPr>
-            <w:r/>
+            <w:r>
+              <w:rPr>
+                <w:rFonts w:ascii="Arial" w:hAnsi="Arial"/>
+                <w:sz w:val="19"/>
+              </w:rPr>
+            </w:r>
             <w:r>
               <w:rPr>
                 <w:rFonts w:ascii="Arial" w:hAnsi="Arial"/>
                 <w:b w:val="0"/>
-                <w:sz w:val="20"/>
+                <w:sz w:val="19"/>
               </w:rPr>
               <w:t>None recorded</w:t>
             </w:r>
@@ -432,181 +696,212 @@
         </w:tc>
       </w:tr>
     </w:tbl>
-    <w:p/>
+    <w:p>
+      <w:pPr>
+        <w:spacing w:after="120" w:line="259" w:lineRule="auto"/>
+      </w:pPr>
+    </w:p>
     <w:p>
       <w:pPr>
         <w:pStyle w:val="Heading1"/>
+        <w:spacing w:after="80" w:line="259" w:lineRule="auto" w:before="160"/>
       </w:pPr>
       <w:r>
         <w:rPr>
           <w:rFonts w:ascii="Arial" w:hAnsi="Arial"/>
+          <w:b/>
+          <w:color w:val="1F4E79"/>
+          <w:sz w:val="26"/>
         </w:rPr>
-        <w:t>Purpose of Meeting</w:t>
+        <w:t>2. Purpose of Meeting</w:t>
       </w:r>
     </w:p>
     <w:p>
       <w:pPr>
         <w:pStyle w:val="ListBullet"/>
+        <w:spacing w:after="120" w:line="259" w:lineRule="auto"/>
       </w:pPr>
       <w:r>
         <w:rPr>
           <w:rFonts w:ascii="Arial" w:hAnsi="Arial"/>
           <w:sz w:val="21"/>
         </w:rPr>
-        <w:t>To understand the 503IT assignment brief and the client requirement to create a working cyber-security or digital safety game prototype.</w:t>
+        <w:t>To review the 503IT assignment brief and identify the required group and individual submission evidence.</w:t>
       </w:r>
     </w:p>
     <w:p>
       <w:pPr>
         <w:pStyle w:val="ListBullet"/>
+        <w:spacing w:after="120" w:line="259" w:lineRule="auto"/>
       </w:pPr>
       <w:r>
         <w:rPr>
           <w:rFonts w:ascii="Arial" w:hAnsi="Arial"/>
           <w:sz w:val="21"/>
         </w:rPr>
-        <w:t>To share initial game ideas and agree an early project direction for development.</w:t>
+        <w:t>To discuss possible cyber-security or digital safety game ideas suitable for a defined audience.</w:t>
       </w:r>
     </w:p>
     <w:p>
       <w:pPr>
         <w:pStyle w:val="ListBullet"/>
+        <w:spacing w:after="120" w:line="259" w:lineRule="auto"/>
       </w:pPr>
       <w:r>
         <w:rPr>
           <w:rFonts w:ascii="Arial" w:hAnsi="Arial"/>
           <w:sz w:val="21"/>
         </w:rPr>
-        <w:t>To divide first-stage responsibilities so that planning, layout, programming, design, and testing work could begin before the next meeting.</w:t>
+        <w:t>To agree an initial concept and allocate first-stage responsibilities for planning, design, development and testing.</w:t>
       </w:r>
     </w:p>
     <w:p>
       <w:pPr>
         <w:pStyle w:val="Heading1"/>
+        <w:spacing w:after="80" w:line="259" w:lineRule="auto" w:before="160"/>
       </w:pPr>
       <w:r>
         <w:rPr>
           <w:rFonts w:ascii="Arial" w:hAnsi="Arial"/>
+          <w:b/>
+          <w:color w:val="1F4E79"/>
+          <w:sz w:val="26"/>
         </w:rPr>
-        <w:t>Agenda</w:t>
+        <w:t>3. Agenda</w:t>
       </w:r>
     </w:p>
     <w:p>
       <w:pPr>
         <w:pStyle w:val="ListNumber"/>
+        <w:spacing w:after="120" w:line="259" w:lineRule="auto"/>
       </w:pPr>
       <w:r>
         <w:rPr>
           <w:rFonts w:ascii="Arial" w:hAnsi="Arial"/>
           <w:sz w:val="21"/>
         </w:rPr>
-        <w:t>Review the assignment brief, including the group presentation and individual portfolio requirements.</w:t>
+        <w:t>Review the client brief and assessment components: group presentation and individual portfolio.</w:t>
       </w:r>
     </w:p>
     <w:p>
       <w:pPr>
         <w:pStyle w:val="ListNumber"/>
+        <w:spacing w:after="120" w:line="259" w:lineRule="auto"/>
       </w:pPr>
       <w:r>
         <w:rPr>
           <w:rFonts w:ascii="Arial" w:hAnsi="Arial"/>
           <w:sz w:val="21"/>
         </w:rPr>
-        <w:t>Discuss possible cyber-security or digital safety game ideas suitable for a clear target audience.</w:t>
+        <w:t>Discuss possible cyber-awareness game concepts and how they could meet the client requirements.</w:t>
       </w:r>
     </w:p>
     <w:p>
       <w:pPr>
         <w:pStyle w:val="ListNumber"/>
+        <w:spacing w:after="120" w:line="259" w:lineRule="auto"/>
       </w:pPr>
       <w:r>
         <w:rPr>
           <w:rFonts w:ascii="Arial" w:hAnsi="Arial"/>
           <w:sz w:val="21"/>
         </w:rPr>
-        <w:t>Agree the first game concept to explore and identify how it could meet the client brief.</w:t>
+        <w:t>Select an initial working idea for further planning.</w:t>
       </w:r>
     </w:p>
     <w:p>
       <w:pPr>
         <w:pStyle w:val="ListNumber"/>
+        <w:spacing w:after="120" w:line="259" w:lineRule="auto"/>
       </w:pPr>
       <w:r>
         <w:rPr>
           <w:rFonts w:ascii="Arial" w:hAnsi="Arial"/>
           <w:sz w:val="21"/>
         </w:rPr>
-        <w:t>Assign initial responsibilities, deadlines, and evidence needed for the portfolio.</w:t>
+        <w:t>Allocate early responsibilities and agree what evidence should be collected for portfolios.</w:t>
       </w:r>
     </w:p>
     <w:p>
       <w:pPr>
         <w:pStyle w:val="Heading1"/>
+        <w:spacing w:after="80" w:line="259" w:lineRule="auto" w:before="160"/>
       </w:pPr>
       <w:r>
         <w:rPr>
           <w:rFonts w:ascii="Arial" w:hAnsi="Arial"/>
+          <w:b/>
+          <w:color w:val="1F4E79"/>
+          <w:sz w:val="26"/>
         </w:rPr>
-        <w:t>Discussion Summary</w:t>
+        <w:t>4. Discussion Summary</w:t>
       </w:r>
     </w:p>
     <w:p>
       <w:pPr>
         <w:pStyle w:val="ListBullet"/>
+        <w:spacing w:after="120" w:line="259" w:lineRule="auto"/>
       </w:pPr>
       <w:r>
         <w:rPr>
           <w:rFonts w:ascii="Arial" w:hAnsi="Arial"/>
           <w:sz w:val="21"/>
         </w:rPr>
-        <w:t>The team reviewed that the final project must be a complete and testable game prototype, supported by evidence of collaboration, planning, communication, and individual contribution.</w:t>
+        <w:t>The team reviewed that the project must produce a complete and testable computer-based game prototype with clear educational value.</w:t>
       </w:r>
     </w:p>
     <w:p>
       <w:pPr>
         <w:pStyle w:val="ListBullet"/>
+        <w:spacing w:after="120" w:line="259" w:lineRule="auto"/>
       </w:pPr>
       <w:r>
         <w:rPr>
           <w:rFonts w:ascii="Arial" w:hAnsi="Arial"/>
           <w:sz w:val="21"/>
         </w:rPr>
-        <w:t>Team members discussed the need for the game to teach cyber awareness in an engaging way, rather than only presenting information as text.</w:t>
+        <w:t>The group discussed cyber-awareness topics such as password safety, online privacy, phishing, and digital responsibility as possible learning content.</w:t>
       </w:r>
     </w:p>
     <w:p>
       <w:pPr>
         <w:pStyle w:val="ListBullet"/>
+        <w:spacing w:after="120" w:line="259" w:lineRule="auto"/>
       </w:pPr>
       <w:r>
         <w:rPr>
           <w:rFonts w:ascii="Arial" w:hAnsi="Arial"/>
           <w:sz w:val="21"/>
         </w:rPr>
-        <w:t>The first proposed concept was an app/game called “The Digital Mirror”, focused on cyber awareness and digital safety. The team agreed this was a starting concept that could be refined after further planning.</w:t>
+        <w:t>An initial concept titled “The Digital Mirror” was proposed as a cyber-awareness app/game. The team agreed that the concept could be refined after further research and feasibility discussion.</w:t>
       </w:r>
     </w:p>
     <w:p>
       <w:pPr>
         <w:pStyle w:val="ListBullet"/>
+        <w:spacing w:after="120" w:line="259" w:lineRule="auto"/>
       </w:pPr>
       <w:r>
         <w:rPr>
           <w:rFonts w:ascii="Arial" w:hAnsi="Arial"/>
           <w:sz w:val="21"/>
         </w:rPr>
-        <w:t>The team noted that meeting records, task allocations, research, testing evidence, and screenshots should be saved because these will support the individual portfolios and reflective reports.</w:t>
+        <w:t>The group recognised that meeting minutes, task allocation, research notes, design sketches, testing evidence and GitHub activity would support the individual portfolio and reflection requirements.</w:t>
       </w:r>
     </w:p>
     <w:p>
       <w:pPr>
         <w:pStyle w:val="Heading1"/>
+        <w:spacing w:after="80" w:line="259" w:lineRule="auto" w:before="160"/>
       </w:pPr>
       <w:r>
         <w:rPr>
           <w:rFonts w:ascii="Arial" w:hAnsi="Arial"/>
+          <w:b/>
+          <w:color w:val="1F4E79"/>
+          <w:sz w:val="26"/>
         </w:rPr>
-        <w:t>Decisions Made</w:t>
+        <w:t>5. Decisions and Rationale</w:t>
       </w:r>
     </w:p>
     <w:tbl>
@@ -614,29 +909,48 @@
         <w:tblStyle w:val="TableGrid"/>
         <w:tblW w:type="auto" w:w="0"/>
         <w:jc w:val="center"/>
+        <w:tblLayout w:type="autofit"/>
         <w:tblLook w:firstColumn="1" w:firstRow="1" w:lastColumn="0" w:lastRow="0" w:noHBand="0" w:noVBand="1" w:val="04A0"/>
       </w:tblPr>
       <w:tblGrid>
-        <w:gridCol w:w="4968"/>
-        <w:gridCol w:w="4968"/>
+        <w:gridCol w:w="5040"/>
+        <w:gridCol w:w="5040"/>
       </w:tblGrid>
       <w:tr>
+        <w:trPr>
+          <w:tblHeader w:val="true"/>
+        </w:trPr>
         <w:tc>
           <w:tcPr>
-            <w:tcW w:type="dxa" w:w="3600"/>
+            <w:tcW w:type="dxa" w:w="3816"/>
             <w:vAlign w:val="center"/>
             <w:shd w:fill="D9EAF7"/>
+            <w:tcBorders>
+              <w:top w:val="single" w:sz="6" w:space="0" w:color="A6A6A6"/>
+              <w:left w:val="single" w:sz="6" w:space="0" w:color="A6A6A6"/>
+              <w:bottom w:val="single" w:sz="6" w:space="0" w:color="A6A6A6"/>
+              <w:right w:val="single" w:sz="6" w:space="0" w:color="A6A6A6"/>
+              <w:insideH w:val="single" w:sz="6" w:space="0" w:color="A6A6A6"/>
+              <w:insideV w:val="single" w:sz="6" w:space="0" w:color="A6A6A6"/>
+            </w:tcBorders>
           </w:tcPr>
           <w:p>
             <w:pPr>
+              <w:spacing w:after="0" w:line="240" w:lineRule="auto"/>
               <w:jc w:val="left"/>
             </w:pPr>
-            <w:r/>
             <w:r>
               <w:rPr>
                 <w:rFonts w:ascii="Arial" w:hAnsi="Arial"/>
                 <w:b/>
-                <w:sz w:val="20"/>
+                <w:sz w:val="19"/>
+              </w:rPr>
+            </w:r>
+            <w:r>
+              <w:rPr>
+                <w:rFonts w:ascii="Arial" w:hAnsi="Arial"/>
+                <w:b/>
+                <w:sz w:val="19"/>
               </w:rPr>
               <w:t>Decision</w:t>
             </w:r>
@@ -644,22 +958,37 @@
         </w:tc>
         <w:tc>
           <w:tcPr>
-            <w:tcW w:type="dxa" w:w="6912"/>
+            <w:tcW w:type="dxa" w:w="6840"/>
             <w:vAlign w:val="center"/>
             <w:shd w:fill="D9EAF7"/>
+            <w:tcBorders>
+              <w:top w:val="single" w:sz="6" w:space="0" w:color="A6A6A6"/>
+              <w:left w:val="single" w:sz="6" w:space="0" w:color="A6A6A6"/>
+              <w:bottom w:val="single" w:sz="6" w:space="0" w:color="A6A6A6"/>
+              <w:right w:val="single" w:sz="6" w:space="0" w:color="A6A6A6"/>
+              <w:insideH w:val="single" w:sz="6" w:space="0" w:color="A6A6A6"/>
+              <w:insideV w:val="single" w:sz="6" w:space="0" w:color="A6A6A6"/>
+            </w:tcBorders>
           </w:tcPr>
           <w:p>
             <w:pPr>
+              <w:spacing w:after="0" w:line="240" w:lineRule="auto"/>
               <w:jc w:val="left"/>
             </w:pPr>
-            <w:r/>
             <w:r>
               <w:rPr>
                 <w:rFonts w:ascii="Arial" w:hAnsi="Arial"/>
                 <w:b/>
-                <w:sz w:val="20"/>
+                <w:sz w:val="19"/>
               </w:rPr>
-              <w:t>Reason / Link to Assignment Brief</w:t>
+            </w:r>
+            <w:r>
+              <w:rPr>
+                <w:rFonts w:ascii="Arial" w:hAnsi="Arial"/>
+                <w:b/>
+                <w:sz w:val="19"/>
+              </w:rPr>
+              <w:t>Academic / Project Rationale</w:t>
             </w:r>
           </w:p>
         </w:tc>
@@ -667,41 +996,69 @@
       <w:tr>
         <w:tc>
           <w:tcPr>
-            <w:tcW w:type="dxa" w:w="3600"/>
+            <w:tcW w:type="dxa" w:w="3816"/>
             <w:vAlign w:val="center"/>
+            <w:tcBorders>
+              <w:top w:val="single" w:sz="6" w:space="0" w:color="A6A6A6"/>
+              <w:left w:val="single" w:sz="6" w:space="0" w:color="A6A6A6"/>
+              <w:bottom w:val="single" w:sz="6" w:space="0" w:color="A6A6A6"/>
+              <w:right w:val="single" w:sz="6" w:space="0" w:color="A6A6A6"/>
+              <w:insideH w:val="single" w:sz="6" w:space="0" w:color="A6A6A6"/>
+              <w:insideV w:val="single" w:sz="6" w:space="0" w:color="A6A6A6"/>
+            </w:tcBorders>
           </w:tcPr>
           <w:p>
             <w:pPr>
+              <w:spacing w:after="0" w:line="240" w:lineRule="auto"/>
               <w:jc w:val="left"/>
             </w:pPr>
-            <w:r/>
+            <w:r>
+              <w:rPr>
+                <w:rFonts w:ascii="Arial" w:hAnsi="Arial"/>
+                <w:sz w:val="19"/>
+              </w:rPr>
+            </w:r>
             <w:r>
               <w:rPr>
                 <w:rFonts w:ascii="Arial" w:hAnsi="Arial"/>
                 <w:b w:val="0"/>
-                <w:sz w:val="20"/>
+                <w:sz w:val="19"/>
               </w:rPr>
-              <w:t>Develop an interactive cyber-awareness app/game prototype.</w:t>
+              <w:t>Proceed with a computer-based cyber-awareness game prototype.</w:t>
             </w:r>
           </w:p>
         </w:tc>
         <w:tc>
           <w:tcPr>
-            <w:tcW w:type="dxa" w:w="6912"/>
+            <w:tcW w:type="dxa" w:w="6840"/>
             <w:vAlign w:val="center"/>
+            <w:tcBorders>
+              <w:top w:val="single" w:sz="6" w:space="0" w:color="A6A6A6"/>
+              <w:left w:val="single" w:sz="6" w:space="0" w:color="A6A6A6"/>
+              <w:bottom w:val="single" w:sz="6" w:space="0" w:color="A6A6A6"/>
+              <w:right w:val="single" w:sz="6" w:space="0" w:color="A6A6A6"/>
+              <w:insideH w:val="single" w:sz="6" w:space="0" w:color="A6A6A6"/>
+              <w:insideV w:val="single" w:sz="6" w:space="0" w:color="A6A6A6"/>
+            </w:tcBorders>
           </w:tcPr>
           <w:p>
             <w:pPr>
+              <w:spacing w:after="0" w:line="240" w:lineRule="auto"/>
               <w:jc w:val="left"/>
             </w:pPr>
-            <w:r/>
+            <w:r>
+              <w:rPr>
+                <w:rFonts w:ascii="Arial" w:hAnsi="Arial"/>
+                <w:sz w:val="19"/>
+              </w:rPr>
+            </w:r>
             <w:r>
               <w:rPr>
                 <w:rFonts w:ascii="Arial" w:hAnsi="Arial"/>
                 <w:b w:val="0"/>
-                <w:sz w:val="20"/>
+                <w:sz w:val="19"/>
               </w:rPr>
-              <w:t>The client brief requires a computer-based game that teaches cyber-security or digital safety concepts.</w:t>
+              <w:t>This directly addresses the client brief, which requires a game that teaches cyber-security or digital safety concepts.</w:t>
             </w:r>
           </w:p>
         </w:tc>
@@ -709,19 +1066,33 @@
       <w:tr>
         <w:tc>
           <w:tcPr>
-            <w:tcW w:type="dxa" w:w="3600"/>
+            <w:tcW w:type="dxa" w:w="3816"/>
             <w:vAlign w:val="center"/>
+            <w:tcBorders>
+              <w:top w:val="single" w:sz="6" w:space="0" w:color="A6A6A6"/>
+              <w:left w:val="single" w:sz="6" w:space="0" w:color="A6A6A6"/>
+              <w:bottom w:val="single" w:sz="6" w:space="0" w:color="A6A6A6"/>
+              <w:right w:val="single" w:sz="6" w:space="0" w:color="A6A6A6"/>
+              <w:insideH w:val="single" w:sz="6" w:space="0" w:color="A6A6A6"/>
+              <w:insideV w:val="single" w:sz="6" w:space="0" w:color="A6A6A6"/>
+            </w:tcBorders>
           </w:tcPr>
           <w:p>
             <w:pPr>
+              <w:spacing w:after="0" w:line="240" w:lineRule="auto"/>
               <w:jc w:val="left"/>
             </w:pPr>
-            <w:r/>
+            <w:r>
+              <w:rPr>
+                <w:rFonts w:ascii="Arial" w:hAnsi="Arial"/>
+                <w:sz w:val="19"/>
+              </w:rPr>
+            </w:r>
             <w:r>
               <w:rPr>
                 <w:rFonts w:ascii="Arial" w:hAnsi="Arial"/>
                 <w:b w:val="0"/>
-                <w:sz w:val="20"/>
+                <w:sz w:val="19"/>
               </w:rPr>
               <w:t>Use “The Digital Mirror” as the initial working title.</w:t>
             </w:r>
@@ -729,21 +1100,35 @@
         </w:tc>
         <w:tc>
           <w:tcPr>
-            <w:tcW w:type="dxa" w:w="6912"/>
+            <w:tcW w:type="dxa" w:w="6840"/>
             <w:vAlign w:val="center"/>
+            <w:tcBorders>
+              <w:top w:val="single" w:sz="6" w:space="0" w:color="A6A6A6"/>
+              <w:left w:val="single" w:sz="6" w:space="0" w:color="A6A6A6"/>
+              <w:bottom w:val="single" w:sz="6" w:space="0" w:color="A6A6A6"/>
+              <w:right w:val="single" w:sz="6" w:space="0" w:color="A6A6A6"/>
+              <w:insideH w:val="single" w:sz="6" w:space="0" w:color="A6A6A6"/>
+              <w:insideV w:val="single" w:sz="6" w:space="0" w:color="A6A6A6"/>
+            </w:tcBorders>
           </w:tcPr>
           <w:p>
             <w:pPr>
+              <w:spacing w:after="0" w:line="240" w:lineRule="auto"/>
               <w:jc w:val="left"/>
             </w:pPr>
-            <w:r/>
+            <w:r>
+              <w:rPr>
+                <w:rFonts w:ascii="Arial" w:hAnsi="Arial"/>
+                <w:sz w:val="19"/>
+              </w:rPr>
+            </w:r>
             <w:r>
               <w:rPr>
                 <w:rFonts w:ascii="Arial" w:hAnsi="Arial"/>
                 <w:b w:val="0"/>
-                <w:sz w:val="20"/>
+                <w:sz w:val="19"/>
               </w:rPr>
-              <w:t>This gave the team a shared concept to begin planning; the title may be reviewed as the design develops.</w:t>
+              <w:t>The title provided a shared starting point for discussion while allowing the concept to be reviewed in later meetings.</w:t>
             </w:r>
           </w:p>
         </w:tc>
@@ -751,41 +1136,69 @@
       <w:tr>
         <w:tc>
           <w:tcPr>
-            <w:tcW w:type="dxa" w:w="3600"/>
+            <w:tcW w:type="dxa" w:w="3816"/>
             <w:vAlign w:val="center"/>
+            <w:tcBorders>
+              <w:top w:val="single" w:sz="6" w:space="0" w:color="A6A6A6"/>
+              <w:left w:val="single" w:sz="6" w:space="0" w:color="A6A6A6"/>
+              <w:bottom w:val="single" w:sz="6" w:space="0" w:color="A6A6A6"/>
+              <w:right w:val="single" w:sz="6" w:space="0" w:color="A6A6A6"/>
+              <w:insideH w:val="single" w:sz="6" w:space="0" w:color="A6A6A6"/>
+              <w:insideV w:val="single" w:sz="6" w:space="0" w:color="A6A6A6"/>
+            </w:tcBorders>
           </w:tcPr>
           <w:p>
             <w:pPr>
+              <w:spacing w:after="0" w:line="240" w:lineRule="auto"/>
               <w:jc w:val="left"/>
             </w:pPr>
-            <w:r/>
+            <w:r>
+              <w:rPr>
+                <w:rFonts w:ascii="Arial" w:hAnsi="Arial"/>
+                <w:sz w:val="19"/>
+              </w:rPr>
+            </w:r>
             <w:r>
               <w:rPr>
                 <w:rFonts w:ascii="Arial" w:hAnsi="Arial"/>
                 <w:b w:val="0"/>
-                <w:sz w:val="20"/>
+                <w:sz w:val="19"/>
               </w:rPr>
-              <w:t>Assign early responsibilities across planning, layout, programming, design, and testing.</w:t>
+              <w:t>Distribute initial responsibilities across planning, layout, programming, design and testing.</w:t>
             </w:r>
           </w:p>
         </w:tc>
         <w:tc>
           <w:tcPr>
-            <w:tcW w:type="dxa" w:w="6912"/>
+            <w:tcW w:type="dxa" w:w="6840"/>
             <w:vAlign w:val="center"/>
+            <w:tcBorders>
+              <w:top w:val="single" w:sz="6" w:space="0" w:color="A6A6A6"/>
+              <w:left w:val="single" w:sz="6" w:space="0" w:color="A6A6A6"/>
+              <w:bottom w:val="single" w:sz="6" w:space="0" w:color="A6A6A6"/>
+              <w:right w:val="single" w:sz="6" w:space="0" w:color="A6A6A6"/>
+              <w:insideH w:val="single" w:sz="6" w:space="0" w:color="A6A6A6"/>
+              <w:insideV w:val="single" w:sz="6" w:space="0" w:color="A6A6A6"/>
+            </w:tcBorders>
           </w:tcPr>
           <w:p>
             <w:pPr>
+              <w:spacing w:after="0" w:line="240" w:lineRule="auto"/>
               <w:jc w:val="left"/>
             </w:pPr>
-            <w:r/>
+            <w:r>
+              <w:rPr>
+                <w:rFonts w:ascii="Arial" w:hAnsi="Arial"/>
+                <w:sz w:val="19"/>
+              </w:rPr>
+            </w:r>
             <w:r>
               <w:rPr>
                 <w:rFonts w:ascii="Arial" w:hAnsi="Arial"/>
                 <w:b w:val="0"/>
-                <w:sz w:val="20"/>
+                <w:sz w:val="19"/>
               </w:rPr>
-              <w:t>The assignment requires evidence of collaborative working and each member’s individual contribution.</w:t>
+              <w:t>This supports collaborative working and provides evidence of each member’s contribution.</w:t>
             </w:r>
           </w:p>
         </w:tc>
@@ -793,56 +1206,92 @@
       <w:tr>
         <w:tc>
           <w:tcPr>
-            <w:tcW w:type="dxa" w:w="3600"/>
+            <w:tcW w:type="dxa" w:w="3816"/>
             <w:vAlign w:val="center"/>
+            <w:tcBorders>
+              <w:top w:val="single" w:sz="6" w:space="0" w:color="A6A6A6"/>
+              <w:left w:val="single" w:sz="6" w:space="0" w:color="A6A6A6"/>
+              <w:bottom w:val="single" w:sz="6" w:space="0" w:color="A6A6A6"/>
+              <w:right w:val="single" w:sz="6" w:space="0" w:color="A6A6A6"/>
+              <w:insideH w:val="single" w:sz="6" w:space="0" w:color="A6A6A6"/>
+              <w:insideV w:val="single" w:sz="6" w:space="0" w:color="A6A6A6"/>
+            </w:tcBorders>
           </w:tcPr>
           <w:p>
             <w:pPr>
+              <w:spacing w:after="0" w:line="240" w:lineRule="auto"/>
               <w:jc w:val="left"/>
             </w:pPr>
-            <w:r/>
+            <w:r>
+              <w:rPr>
+                <w:rFonts w:ascii="Arial" w:hAnsi="Arial"/>
+                <w:sz w:val="19"/>
+              </w:rPr>
+            </w:r>
             <w:r>
               <w:rPr>
                 <w:rFonts w:ascii="Arial" w:hAnsi="Arial"/>
                 <w:b w:val="0"/>
-                <w:sz w:val="20"/>
+                <w:sz w:val="19"/>
               </w:rPr>
-              <w:t>Keep meeting minutes and task evidence from the start of the project.</w:t>
+              <w:t>Maintain formal meeting records and project evidence from the beginning.</w:t>
             </w:r>
           </w:p>
         </w:tc>
         <w:tc>
           <w:tcPr>
-            <w:tcW w:type="dxa" w:w="6912"/>
+            <w:tcW w:type="dxa" w:w="6840"/>
             <w:vAlign w:val="center"/>
+            <w:tcBorders>
+              <w:top w:val="single" w:sz="6" w:space="0" w:color="A6A6A6"/>
+              <w:left w:val="single" w:sz="6" w:space="0" w:color="A6A6A6"/>
+              <w:bottom w:val="single" w:sz="6" w:space="0" w:color="A6A6A6"/>
+              <w:right w:val="single" w:sz="6" w:space="0" w:color="A6A6A6"/>
+              <w:insideH w:val="single" w:sz="6" w:space="0" w:color="A6A6A6"/>
+              <w:insideV w:val="single" w:sz="6" w:space="0" w:color="A6A6A6"/>
+            </w:tcBorders>
           </w:tcPr>
           <w:p>
             <w:pPr>
+              <w:spacing w:after="0" w:line="240" w:lineRule="auto"/>
               <w:jc w:val="left"/>
             </w:pPr>
-            <w:r/>
+            <w:r>
+              <w:rPr>
+                <w:rFonts w:ascii="Arial" w:hAnsi="Arial"/>
+                <w:sz w:val="19"/>
+              </w:rPr>
+            </w:r>
             <w:r>
               <w:rPr>
                 <w:rFonts w:ascii="Arial" w:hAnsi="Arial"/>
                 <w:b w:val="0"/>
-                <w:sz w:val="20"/>
+                <w:sz w:val="19"/>
               </w:rPr>
-              <w:t>Meeting notes, timelines, task logs, and communication evidence are required for the individual portfolio.</w:t>
+              <w:t>The individual portfolio requires evidence of planning, communication, decision-making and contribution.</w:t>
             </w:r>
           </w:p>
         </w:tc>
       </w:tr>
     </w:tbl>
-    <w:p/>
+    <w:p>
+      <w:pPr>
+        <w:spacing w:after="120" w:line="259" w:lineRule="auto"/>
+      </w:pPr>
+    </w:p>
     <w:p>
       <w:pPr>
         <w:pStyle w:val="Heading1"/>
+        <w:spacing w:after="80" w:line="259" w:lineRule="auto" w:before="160"/>
       </w:pPr>
       <w:r>
         <w:rPr>
           <w:rFonts w:ascii="Arial" w:hAnsi="Arial"/>
+          <w:b/>
+          <w:color w:val="1F4E79"/>
+          <w:sz w:val="26"/>
         </w:rPr>
-        <w:t>Action Items</w:t>
+        <w:t>6. Action Log</w:t>
       </w:r>
     </w:p>
     <w:tbl>
@@ -850,73 +1299,122 @@
         <w:tblStyle w:val="TableGrid"/>
         <w:tblW w:type="auto" w:w="0"/>
         <w:jc w:val="center"/>
+        <w:tblLayout w:type="autofit"/>
         <w:tblLook w:firstColumn="1" w:firstRow="1" w:lastColumn="0" w:lastRow="0" w:noHBand="0" w:noVBand="1" w:val="04A0"/>
       </w:tblPr>
       <w:tblGrid>
-        <w:gridCol w:w="2484"/>
-        <w:gridCol w:w="2484"/>
-        <w:gridCol w:w="2484"/>
-        <w:gridCol w:w="2484"/>
+        <w:gridCol w:w="2520"/>
+        <w:gridCol w:w="2520"/>
+        <w:gridCol w:w="2520"/>
+        <w:gridCol w:w="2520"/>
       </w:tblGrid>
       <w:tr>
+        <w:trPr>
+          <w:tblHeader w:val="true"/>
+        </w:trPr>
         <w:tc>
           <w:tcPr>
-            <w:tcW w:type="dxa" w:w="3024"/>
+            <w:tcW w:type="dxa" w:w="2880"/>
             <w:vAlign w:val="center"/>
             <w:shd w:fill="D9EAF7"/>
+            <w:tcBorders>
+              <w:top w:val="single" w:sz="6" w:space="0" w:color="A6A6A6"/>
+              <w:left w:val="single" w:sz="6" w:space="0" w:color="A6A6A6"/>
+              <w:bottom w:val="single" w:sz="6" w:space="0" w:color="A6A6A6"/>
+              <w:right w:val="single" w:sz="6" w:space="0" w:color="A6A6A6"/>
+              <w:insideH w:val="single" w:sz="6" w:space="0" w:color="A6A6A6"/>
+              <w:insideV w:val="single" w:sz="6" w:space="0" w:color="A6A6A6"/>
+            </w:tcBorders>
           </w:tcPr>
           <w:p>
             <w:pPr>
+              <w:spacing w:after="0" w:line="240" w:lineRule="auto"/>
               <w:jc w:val="left"/>
             </w:pPr>
-            <w:r/>
             <w:r>
               <w:rPr>
                 <w:rFonts w:ascii="Arial" w:hAnsi="Arial"/>
                 <w:b/>
-                <w:sz w:val="20"/>
+                <w:sz w:val="19"/>
               </w:rPr>
-              <w:t>Task / Action</w:t>
+            </w:r>
+            <w:r>
+              <w:rPr>
+                <w:rFonts w:ascii="Arial" w:hAnsi="Arial"/>
+                <w:b/>
+                <w:sz w:val="19"/>
+              </w:rPr>
+              <w:t>Action</w:t>
             </w:r>
           </w:p>
         </w:tc>
         <w:tc>
           <w:tcPr>
-            <w:tcW w:type="dxa" w:w="2448"/>
+            <w:tcW w:type="dxa" w:w="2376"/>
             <w:vAlign w:val="center"/>
             <w:shd w:fill="D9EAF7"/>
+            <w:tcBorders>
+              <w:top w:val="single" w:sz="6" w:space="0" w:color="A6A6A6"/>
+              <w:left w:val="single" w:sz="6" w:space="0" w:color="A6A6A6"/>
+              <w:bottom w:val="single" w:sz="6" w:space="0" w:color="A6A6A6"/>
+              <w:right w:val="single" w:sz="6" w:space="0" w:color="A6A6A6"/>
+              <w:insideH w:val="single" w:sz="6" w:space="0" w:color="A6A6A6"/>
+              <w:insideV w:val="single" w:sz="6" w:space="0" w:color="A6A6A6"/>
+            </w:tcBorders>
           </w:tcPr>
           <w:p>
             <w:pPr>
+              <w:spacing w:after="0" w:line="240" w:lineRule="auto"/>
               <w:jc w:val="left"/>
             </w:pPr>
-            <w:r/>
             <w:r>
               <w:rPr>
                 <w:rFonts w:ascii="Arial" w:hAnsi="Arial"/>
                 <w:b/>
-                <w:sz w:val="20"/>
+                <w:sz w:val="19"/>
               </w:rPr>
-              <w:t>Responsible Person(s)</w:t>
+            </w:r>
+            <w:r>
+              <w:rPr>
+                <w:rFonts w:ascii="Arial" w:hAnsi="Arial"/>
+                <w:b/>
+                <w:sz w:val="19"/>
+              </w:rPr>
+              <w:t>Owner(s)</w:t>
             </w:r>
           </w:p>
         </w:tc>
         <w:tc>
           <w:tcPr>
-            <w:tcW w:type="dxa" w:w="1584"/>
+            <w:tcW w:type="dxa" w:w="1440"/>
             <w:vAlign w:val="center"/>
             <w:shd w:fill="D9EAF7"/>
+            <w:tcBorders>
+              <w:top w:val="single" w:sz="6" w:space="0" w:color="A6A6A6"/>
+              <w:left w:val="single" w:sz="6" w:space="0" w:color="A6A6A6"/>
+              <w:bottom w:val="single" w:sz="6" w:space="0" w:color="A6A6A6"/>
+              <w:right w:val="single" w:sz="6" w:space="0" w:color="A6A6A6"/>
+              <w:insideH w:val="single" w:sz="6" w:space="0" w:color="A6A6A6"/>
+              <w:insideV w:val="single" w:sz="6" w:space="0" w:color="A6A6A6"/>
+            </w:tcBorders>
           </w:tcPr>
           <w:p>
             <w:pPr>
+              <w:spacing w:after="0" w:line="240" w:lineRule="auto"/>
               <w:jc w:val="left"/>
             </w:pPr>
-            <w:r/>
             <w:r>
               <w:rPr>
                 <w:rFonts w:ascii="Arial" w:hAnsi="Arial"/>
                 <w:b/>
-                <w:sz w:val="20"/>
+                <w:sz w:val="19"/>
+              </w:rPr>
+            </w:r>
+            <w:r>
+              <w:rPr>
+                <w:rFonts w:ascii="Arial" w:hAnsi="Arial"/>
+                <w:b/>
+                <w:sz w:val="19"/>
               </w:rPr>
               <w:t>Deadline</w:t>
             </w:r>
@@ -924,22 +1422,928 @@
         </w:tc>
         <w:tc>
           <w:tcPr>
-            <w:tcW w:type="dxa" w:w="3456"/>
+            <w:tcW w:type="dxa" w:w="3960"/>
             <w:vAlign w:val="center"/>
             <w:shd w:fill="D9EAF7"/>
+            <w:tcBorders>
+              <w:top w:val="single" w:sz="6" w:space="0" w:color="A6A6A6"/>
+              <w:left w:val="single" w:sz="6" w:space="0" w:color="A6A6A6"/>
+              <w:bottom w:val="single" w:sz="6" w:space="0" w:color="A6A6A6"/>
+              <w:right w:val="single" w:sz="6" w:space="0" w:color="A6A6A6"/>
+              <w:insideH w:val="single" w:sz="6" w:space="0" w:color="A6A6A6"/>
+              <w:insideV w:val="single" w:sz="6" w:space="0" w:color="A6A6A6"/>
+            </w:tcBorders>
           </w:tcPr>
           <w:p>
             <w:pPr>
+              <w:spacing w:after="0" w:line="240" w:lineRule="auto"/>
               <w:jc w:val="left"/>
             </w:pPr>
-            <w:r/>
             <w:r>
               <w:rPr>
                 <w:rFonts w:ascii="Arial" w:hAnsi="Arial"/>
                 <w:b/>
-                <w:sz w:val="20"/>
+                <w:sz w:val="19"/>
               </w:rPr>
-              <w:t>Evidence to Keep</w:t>
+            </w:r>
+            <w:r>
+              <w:rPr>
+                <w:rFonts w:ascii="Arial" w:hAnsi="Arial"/>
+                <w:b/>
+                <w:sz w:val="19"/>
+              </w:rPr>
+              <w:t>Evidence / Output Required</w:t>
+            </w:r>
+          </w:p>
+        </w:tc>
+      </w:tr>
+      <w:tr>
+        <w:tc>
+          <w:tcPr>
+            <w:tcW w:type="dxa" w:w="2880"/>
+            <w:vAlign w:val="center"/>
+            <w:tcBorders>
+              <w:top w:val="single" w:sz="6" w:space="0" w:color="A6A6A6"/>
+              <w:left w:val="single" w:sz="6" w:space="0" w:color="A6A6A6"/>
+              <w:bottom w:val="single" w:sz="6" w:space="0" w:color="A6A6A6"/>
+              <w:right w:val="single" w:sz="6" w:space="0" w:color="A6A6A6"/>
+              <w:insideH w:val="single" w:sz="6" w:space="0" w:color="A6A6A6"/>
+              <w:insideV w:val="single" w:sz="6" w:space="0" w:color="A6A6A6"/>
+            </w:tcBorders>
+          </w:tcPr>
+          <w:p>
+            <w:pPr>
+              <w:spacing w:after="0" w:line="240" w:lineRule="auto"/>
+              <w:jc w:val="left"/>
+            </w:pPr>
+            <w:r>
+              <w:rPr>
+                <w:rFonts w:ascii="Arial" w:hAnsi="Arial"/>
+                <w:sz w:val="19"/>
+              </w:rPr>
+            </w:r>
+            <w:r>
+              <w:rPr>
+                <w:rFonts w:ascii="Arial" w:hAnsi="Arial"/>
+                <w:b w:val="0"/>
+                <w:sz w:val="19"/>
+              </w:rPr>
+              <w:t>Create initial project plan and timeline</w:t>
+            </w:r>
+          </w:p>
+        </w:tc>
+        <w:tc>
+          <w:tcPr>
+            <w:tcW w:type="dxa" w:w="2376"/>
+            <w:vAlign w:val="center"/>
+            <w:tcBorders>
+              <w:top w:val="single" w:sz="6" w:space="0" w:color="A6A6A6"/>
+              <w:left w:val="single" w:sz="6" w:space="0" w:color="A6A6A6"/>
+              <w:bottom w:val="single" w:sz="6" w:space="0" w:color="A6A6A6"/>
+              <w:right w:val="single" w:sz="6" w:space="0" w:color="A6A6A6"/>
+              <w:insideH w:val="single" w:sz="6" w:space="0" w:color="A6A6A6"/>
+              <w:insideV w:val="single" w:sz="6" w:space="0" w:color="A6A6A6"/>
+            </w:tcBorders>
+          </w:tcPr>
+          <w:p>
+            <w:pPr>
+              <w:spacing w:after="0" w:line="240" w:lineRule="auto"/>
+              <w:jc w:val="left"/>
+            </w:pPr>
+            <w:r>
+              <w:rPr>
+                <w:rFonts w:ascii="Arial" w:hAnsi="Arial"/>
+                <w:sz w:val="19"/>
+              </w:rPr>
+            </w:r>
+            <w:r>
+              <w:rPr>
+                <w:rFonts w:ascii="Arial" w:hAnsi="Arial"/>
+                <w:b w:val="0"/>
+                <w:sz w:val="19"/>
+              </w:rPr>
+              <w:t>Renita V Kapdiya, Sabina Mahat</w:t>
+            </w:r>
+          </w:p>
+        </w:tc>
+        <w:tc>
+          <w:tcPr>
+            <w:tcW w:type="dxa" w:w="1440"/>
+            <w:vAlign w:val="center"/>
+            <w:tcBorders>
+              <w:top w:val="single" w:sz="6" w:space="0" w:color="A6A6A6"/>
+              <w:left w:val="single" w:sz="6" w:space="0" w:color="A6A6A6"/>
+              <w:bottom w:val="single" w:sz="6" w:space="0" w:color="A6A6A6"/>
+              <w:right w:val="single" w:sz="6" w:space="0" w:color="A6A6A6"/>
+              <w:insideH w:val="single" w:sz="6" w:space="0" w:color="A6A6A6"/>
+              <w:insideV w:val="single" w:sz="6" w:space="0" w:color="A6A6A6"/>
+            </w:tcBorders>
+          </w:tcPr>
+          <w:p>
+            <w:pPr>
+              <w:spacing w:after="0" w:line="240" w:lineRule="auto"/>
+              <w:jc w:val="left"/>
+            </w:pPr>
+            <w:r>
+              <w:rPr>
+                <w:rFonts w:ascii="Arial" w:hAnsi="Arial"/>
+                <w:sz w:val="19"/>
+              </w:rPr>
+            </w:r>
+            <w:r>
+              <w:rPr>
+                <w:rFonts w:ascii="Arial" w:hAnsi="Arial"/>
+                <w:b w:val="0"/>
+                <w:sz w:val="19"/>
+              </w:rPr>
+              <w:t>22/05/2026</w:t>
+            </w:r>
+          </w:p>
+        </w:tc>
+        <w:tc>
+          <w:tcPr>
+            <w:tcW w:type="dxa" w:w="3960"/>
+            <w:vAlign w:val="center"/>
+            <w:tcBorders>
+              <w:top w:val="single" w:sz="6" w:space="0" w:color="A6A6A6"/>
+              <w:left w:val="single" w:sz="6" w:space="0" w:color="A6A6A6"/>
+              <w:bottom w:val="single" w:sz="6" w:space="0" w:color="A6A6A6"/>
+              <w:right w:val="single" w:sz="6" w:space="0" w:color="A6A6A6"/>
+              <w:insideH w:val="single" w:sz="6" w:space="0" w:color="A6A6A6"/>
+              <w:insideV w:val="single" w:sz="6" w:space="0" w:color="A6A6A6"/>
+            </w:tcBorders>
+          </w:tcPr>
+          <w:p>
+            <w:pPr>
+              <w:spacing w:after="0" w:line="240" w:lineRule="auto"/>
+              <w:jc w:val="left"/>
+            </w:pPr>
+            <w:r>
+              <w:rPr>
+                <w:rFonts w:ascii="Arial" w:hAnsi="Arial"/>
+                <w:sz w:val="19"/>
+              </w:rPr>
+            </w:r>
+            <w:r>
+              <w:rPr>
+                <w:rFonts w:ascii="Arial" w:hAnsi="Arial"/>
+                <w:b w:val="0"/>
+                <w:sz w:val="19"/>
+              </w:rPr>
+              <w:t>Planning notes, timeline or task list</w:t>
+            </w:r>
+          </w:p>
+        </w:tc>
+      </w:tr>
+      <w:tr>
+        <w:tc>
+          <w:tcPr>
+            <w:tcW w:type="dxa" w:w="2880"/>
+            <w:vAlign w:val="center"/>
+            <w:tcBorders>
+              <w:top w:val="single" w:sz="6" w:space="0" w:color="A6A6A6"/>
+              <w:left w:val="single" w:sz="6" w:space="0" w:color="A6A6A6"/>
+              <w:bottom w:val="single" w:sz="6" w:space="0" w:color="A6A6A6"/>
+              <w:right w:val="single" w:sz="6" w:space="0" w:color="A6A6A6"/>
+              <w:insideH w:val="single" w:sz="6" w:space="0" w:color="A6A6A6"/>
+              <w:insideV w:val="single" w:sz="6" w:space="0" w:color="A6A6A6"/>
+            </w:tcBorders>
+          </w:tcPr>
+          <w:p>
+            <w:pPr>
+              <w:spacing w:after="0" w:line="240" w:lineRule="auto"/>
+              <w:jc w:val="left"/>
+            </w:pPr>
+            <w:r>
+              <w:rPr>
+                <w:rFonts w:ascii="Arial" w:hAnsi="Arial"/>
+                <w:sz w:val="19"/>
+              </w:rPr>
+            </w:r>
+            <w:r>
+              <w:rPr>
+                <w:rFonts w:ascii="Arial" w:hAnsi="Arial"/>
+                <w:b w:val="0"/>
+                <w:sz w:val="19"/>
+              </w:rPr>
+              <w:t>Outline the base layout and early user journey</w:t>
+            </w:r>
+          </w:p>
+        </w:tc>
+        <w:tc>
+          <w:tcPr>
+            <w:tcW w:type="dxa" w:w="2376"/>
+            <w:vAlign w:val="center"/>
+            <w:tcBorders>
+              <w:top w:val="single" w:sz="6" w:space="0" w:color="A6A6A6"/>
+              <w:left w:val="single" w:sz="6" w:space="0" w:color="A6A6A6"/>
+              <w:bottom w:val="single" w:sz="6" w:space="0" w:color="A6A6A6"/>
+              <w:right w:val="single" w:sz="6" w:space="0" w:color="A6A6A6"/>
+              <w:insideH w:val="single" w:sz="6" w:space="0" w:color="A6A6A6"/>
+              <w:insideV w:val="single" w:sz="6" w:space="0" w:color="A6A6A6"/>
+            </w:tcBorders>
+          </w:tcPr>
+          <w:p>
+            <w:pPr>
+              <w:spacing w:after="0" w:line="240" w:lineRule="auto"/>
+              <w:jc w:val="left"/>
+            </w:pPr>
+            <w:r>
+              <w:rPr>
+                <w:rFonts w:ascii="Arial" w:hAnsi="Arial"/>
+                <w:sz w:val="19"/>
+              </w:rPr>
+            </w:r>
+            <w:r>
+              <w:rPr>
+                <w:rFonts w:ascii="Arial" w:hAnsi="Arial"/>
+                <w:b w:val="0"/>
+                <w:sz w:val="19"/>
+              </w:rPr>
+              <w:t>All team members</w:t>
+            </w:r>
+          </w:p>
+        </w:tc>
+        <w:tc>
+          <w:tcPr>
+            <w:tcW w:type="dxa" w:w="1440"/>
+            <w:vAlign w:val="center"/>
+            <w:tcBorders>
+              <w:top w:val="single" w:sz="6" w:space="0" w:color="A6A6A6"/>
+              <w:left w:val="single" w:sz="6" w:space="0" w:color="A6A6A6"/>
+              <w:bottom w:val="single" w:sz="6" w:space="0" w:color="A6A6A6"/>
+              <w:right w:val="single" w:sz="6" w:space="0" w:color="A6A6A6"/>
+              <w:insideH w:val="single" w:sz="6" w:space="0" w:color="A6A6A6"/>
+              <w:insideV w:val="single" w:sz="6" w:space="0" w:color="A6A6A6"/>
+            </w:tcBorders>
+          </w:tcPr>
+          <w:p>
+            <w:pPr>
+              <w:spacing w:after="0" w:line="240" w:lineRule="auto"/>
+              <w:jc w:val="left"/>
+            </w:pPr>
+            <w:r>
+              <w:rPr>
+                <w:rFonts w:ascii="Arial" w:hAnsi="Arial"/>
+                <w:sz w:val="19"/>
+              </w:rPr>
+            </w:r>
+            <w:r>
+              <w:rPr>
+                <w:rFonts w:ascii="Arial" w:hAnsi="Arial"/>
+                <w:b w:val="0"/>
+                <w:sz w:val="19"/>
+              </w:rPr>
+              <w:t>22/05/2026</w:t>
+            </w:r>
+          </w:p>
+        </w:tc>
+        <w:tc>
+          <w:tcPr>
+            <w:tcW w:type="dxa" w:w="3960"/>
+            <w:vAlign w:val="center"/>
+            <w:tcBorders>
+              <w:top w:val="single" w:sz="6" w:space="0" w:color="A6A6A6"/>
+              <w:left w:val="single" w:sz="6" w:space="0" w:color="A6A6A6"/>
+              <w:bottom w:val="single" w:sz="6" w:space="0" w:color="A6A6A6"/>
+              <w:right w:val="single" w:sz="6" w:space="0" w:color="A6A6A6"/>
+              <w:insideH w:val="single" w:sz="6" w:space="0" w:color="A6A6A6"/>
+              <w:insideV w:val="single" w:sz="6" w:space="0" w:color="A6A6A6"/>
+            </w:tcBorders>
+          </w:tcPr>
+          <w:p>
+            <w:pPr>
+              <w:spacing w:after="0" w:line="240" w:lineRule="auto"/>
+              <w:jc w:val="left"/>
+            </w:pPr>
+            <w:r>
+              <w:rPr>
+                <w:rFonts w:ascii="Arial" w:hAnsi="Arial"/>
+                <w:sz w:val="19"/>
+              </w:rPr>
+            </w:r>
+            <w:r>
+              <w:rPr>
+                <w:rFonts w:ascii="Arial" w:hAnsi="Arial"/>
+                <w:b w:val="0"/>
+                <w:sz w:val="19"/>
+              </w:rPr>
+              <w:t>Sketches, wireframes or written layout notes</w:t>
+            </w:r>
+          </w:p>
+        </w:tc>
+      </w:tr>
+      <w:tr>
+        <w:tc>
+          <w:tcPr>
+            <w:tcW w:type="dxa" w:w="2880"/>
+            <w:vAlign w:val="center"/>
+            <w:tcBorders>
+              <w:top w:val="single" w:sz="6" w:space="0" w:color="A6A6A6"/>
+              <w:left w:val="single" w:sz="6" w:space="0" w:color="A6A6A6"/>
+              <w:bottom w:val="single" w:sz="6" w:space="0" w:color="A6A6A6"/>
+              <w:right w:val="single" w:sz="6" w:space="0" w:color="A6A6A6"/>
+              <w:insideH w:val="single" w:sz="6" w:space="0" w:color="A6A6A6"/>
+              <w:insideV w:val="single" w:sz="6" w:space="0" w:color="A6A6A6"/>
+            </w:tcBorders>
+          </w:tcPr>
+          <w:p>
+            <w:pPr>
+              <w:spacing w:after="0" w:line="240" w:lineRule="auto"/>
+              <w:jc w:val="left"/>
+            </w:pPr>
+            <w:r>
+              <w:rPr>
+                <w:rFonts w:ascii="Arial" w:hAnsi="Arial"/>
+                <w:sz w:val="19"/>
+              </w:rPr>
+            </w:r>
+            <w:r>
+              <w:rPr>
+                <w:rFonts w:ascii="Arial" w:hAnsi="Arial"/>
+                <w:b w:val="0"/>
+                <w:sz w:val="19"/>
+              </w:rPr>
+              <w:t>Begin prototype structure</w:t>
+            </w:r>
+          </w:p>
+        </w:tc>
+        <w:tc>
+          <w:tcPr>
+            <w:tcW w:type="dxa" w:w="2376"/>
+            <w:vAlign w:val="center"/>
+            <w:tcBorders>
+              <w:top w:val="single" w:sz="6" w:space="0" w:color="A6A6A6"/>
+              <w:left w:val="single" w:sz="6" w:space="0" w:color="A6A6A6"/>
+              <w:bottom w:val="single" w:sz="6" w:space="0" w:color="A6A6A6"/>
+              <w:right w:val="single" w:sz="6" w:space="0" w:color="A6A6A6"/>
+              <w:insideH w:val="single" w:sz="6" w:space="0" w:color="A6A6A6"/>
+              <w:insideV w:val="single" w:sz="6" w:space="0" w:color="A6A6A6"/>
+            </w:tcBorders>
+          </w:tcPr>
+          <w:p>
+            <w:pPr>
+              <w:spacing w:after="0" w:line="240" w:lineRule="auto"/>
+              <w:jc w:val="left"/>
+            </w:pPr>
+            <w:r>
+              <w:rPr>
+                <w:rFonts w:ascii="Arial" w:hAnsi="Arial"/>
+                <w:sz w:val="19"/>
+              </w:rPr>
+            </w:r>
+            <w:r>
+              <w:rPr>
+                <w:rFonts w:ascii="Arial" w:hAnsi="Arial"/>
+                <w:b w:val="0"/>
+                <w:sz w:val="19"/>
+              </w:rPr>
+              <w:t>Richa Sorathiya</w:t>
+            </w:r>
+          </w:p>
+        </w:tc>
+        <w:tc>
+          <w:tcPr>
+            <w:tcW w:type="dxa" w:w="1440"/>
+            <w:vAlign w:val="center"/>
+            <w:tcBorders>
+              <w:top w:val="single" w:sz="6" w:space="0" w:color="A6A6A6"/>
+              <w:left w:val="single" w:sz="6" w:space="0" w:color="A6A6A6"/>
+              <w:bottom w:val="single" w:sz="6" w:space="0" w:color="A6A6A6"/>
+              <w:right w:val="single" w:sz="6" w:space="0" w:color="A6A6A6"/>
+              <w:insideH w:val="single" w:sz="6" w:space="0" w:color="A6A6A6"/>
+              <w:insideV w:val="single" w:sz="6" w:space="0" w:color="A6A6A6"/>
+            </w:tcBorders>
+          </w:tcPr>
+          <w:p>
+            <w:pPr>
+              <w:spacing w:after="0" w:line="240" w:lineRule="auto"/>
+              <w:jc w:val="left"/>
+            </w:pPr>
+            <w:r>
+              <w:rPr>
+                <w:rFonts w:ascii="Arial" w:hAnsi="Arial"/>
+                <w:sz w:val="19"/>
+              </w:rPr>
+            </w:r>
+            <w:r>
+              <w:rPr>
+                <w:rFonts w:ascii="Arial" w:hAnsi="Arial"/>
+                <w:b w:val="0"/>
+                <w:sz w:val="19"/>
+              </w:rPr>
+              <w:t>26/05/2026</w:t>
+            </w:r>
+          </w:p>
+        </w:tc>
+        <w:tc>
+          <w:tcPr>
+            <w:tcW w:type="dxa" w:w="3960"/>
+            <w:vAlign w:val="center"/>
+            <w:tcBorders>
+              <w:top w:val="single" w:sz="6" w:space="0" w:color="A6A6A6"/>
+              <w:left w:val="single" w:sz="6" w:space="0" w:color="A6A6A6"/>
+              <w:bottom w:val="single" w:sz="6" w:space="0" w:color="A6A6A6"/>
+              <w:right w:val="single" w:sz="6" w:space="0" w:color="A6A6A6"/>
+              <w:insideH w:val="single" w:sz="6" w:space="0" w:color="A6A6A6"/>
+              <w:insideV w:val="single" w:sz="6" w:space="0" w:color="A6A6A6"/>
+            </w:tcBorders>
+          </w:tcPr>
+          <w:p>
+            <w:pPr>
+              <w:spacing w:after="0" w:line="240" w:lineRule="auto"/>
+              <w:jc w:val="left"/>
+            </w:pPr>
+            <w:r>
+              <w:rPr>
+                <w:rFonts w:ascii="Arial" w:hAnsi="Arial"/>
+                <w:sz w:val="19"/>
+              </w:rPr>
+            </w:r>
+            <w:r>
+              <w:rPr>
+                <w:rFonts w:ascii="Arial" w:hAnsi="Arial"/>
+                <w:b w:val="0"/>
+                <w:sz w:val="19"/>
+              </w:rPr>
+              <w:t>Initial HTML/CSS/JavaScript files and GitHub commits</w:t>
+            </w:r>
+          </w:p>
+        </w:tc>
+      </w:tr>
+      <w:tr>
+        <w:tc>
+          <w:tcPr>
+            <w:tcW w:type="dxa" w:w="2880"/>
+            <w:vAlign w:val="center"/>
+            <w:tcBorders>
+              <w:top w:val="single" w:sz="6" w:space="0" w:color="A6A6A6"/>
+              <w:left w:val="single" w:sz="6" w:space="0" w:color="A6A6A6"/>
+              <w:bottom w:val="single" w:sz="6" w:space="0" w:color="A6A6A6"/>
+              <w:right w:val="single" w:sz="6" w:space="0" w:color="A6A6A6"/>
+              <w:insideH w:val="single" w:sz="6" w:space="0" w:color="A6A6A6"/>
+              <w:insideV w:val="single" w:sz="6" w:space="0" w:color="A6A6A6"/>
+            </w:tcBorders>
+          </w:tcPr>
+          <w:p>
+            <w:pPr>
+              <w:spacing w:after="0" w:line="240" w:lineRule="auto"/>
+              <w:jc w:val="left"/>
+            </w:pPr>
+            <w:r>
+              <w:rPr>
+                <w:rFonts w:ascii="Arial" w:hAnsi="Arial"/>
+                <w:sz w:val="19"/>
+              </w:rPr>
+            </w:r>
+            <w:r>
+              <w:rPr>
+                <w:rFonts w:ascii="Arial" w:hAnsi="Arial"/>
+                <w:b w:val="0"/>
+                <w:sz w:val="19"/>
+              </w:rPr>
+              <w:t>Develop early visual design ideas</w:t>
+            </w:r>
+          </w:p>
+        </w:tc>
+        <w:tc>
+          <w:tcPr>
+            <w:tcW w:type="dxa" w:w="2376"/>
+            <w:vAlign w:val="center"/>
+            <w:tcBorders>
+              <w:top w:val="single" w:sz="6" w:space="0" w:color="A6A6A6"/>
+              <w:left w:val="single" w:sz="6" w:space="0" w:color="A6A6A6"/>
+              <w:bottom w:val="single" w:sz="6" w:space="0" w:color="A6A6A6"/>
+              <w:right w:val="single" w:sz="6" w:space="0" w:color="A6A6A6"/>
+              <w:insideH w:val="single" w:sz="6" w:space="0" w:color="A6A6A6"/>
+              <w:insideV w:val="single" w:sz="6" w:space="0" w:color="A6A6A6"/>
+            </w:tcBorders>
+          </w:tcPr>
+          <w:p>
+            <w:pPr>
+              <w:spacing w:after="0" w:line="240" w:lineRule="auto"/>
+              <w:jc w:val="left"/>
+            </w:pPr>
+            <w:r>
+              <w:rPr>
+                <w:rFonts w:ascii="Arial" w:hAnsi="Arial"/>
+                <w:sz w:val="19"/>
+              </w:rPr>
+            </w:r>
+            <w:r>
+              <w:rPr>
+                <w:rFonts w:ascii="Arial" w:hAnsi="Arial"/>
+                <w:b w:val="0"/>
+                <w:sz w:val="19"/>
+              </w:rPr>
+              <w:t>Kaberi Shrestha</w:t>
+            </w:r>
+          </w:p>
+        </w:tc>
+        <w:tc>
+          <w:tcPr>
+            <w:tcW w:type="dxa" w:w="1440"/>
+            <w:vAlign w:val="center"/>
+            <w:tcBorders>
+              <w:top w:val="single" w:sz="6" w:space="0" w:color="A6A6A6"/>
+              <w:left w:val="single" w:sz="6" w:space="0" w:color="A6A6A6"/>
+              <w:bottom w:val="single" w:sz="6" w:space="0" w:color="A6A6A6"/>
+              <w:right w:val="single" w:sz="6" w:space="0" w:color="A6A6A6"/>
+              <w:insideH w:val="single" w:sz="6" w:space="0" w:color="A6A6A6"/>
+              <w:insideV w:val="single" w:sz="6" w:space="0" w:color="A6A6A6"/>
+            </w:tcBorders>
+          </w:tcPr>
+          <w:p>
+            <w:pPr>
+              <w:spacing w:after="0" w:line="240" w:lineRule="auto"/>
+              <w:jc w:val="left"/>
+            </w:pPr>
+            <w:r>
+              <w:rPr>
+                <w:rFonts w:ascii="Arial" w:hAnsi="Arial"/>
+                <w:sz w:val="19"/>
+              </w:rPr>
+            </w:r>
+            <w:r>
+              <w:rPr>
+                <w:rFonts w:ascii="Arial" w:hAnsi="Arial"/>
+                <w:b w:val="0"/>
+                <w:sz w:val="19"/>
+              </w:rPr>
+              <w:t>29/05/2026</w:t>
+            </w:r>
+          </w:p>
+        </w:tc>
+        <w:tc>
+          <w:tcPr>
+            <w:tcW w:type="dxa" w:w="3960"/>
+            <w:vAlign w:val="center"/>
+            <w:tcBorders>
+              <w:top w:val="single" w:sz="6" w:space="0" w:color="A6A6A6"/>
+              <w:left w:val="single" w:sz="6" w:space="0" w:color="A6A6A6"/>
+              <w:bottom w:val="single" w:sz="6" w:space="0" w:color="A6A6A6"/>
+              <w:right w:val="single" w:sz="6" w:space="0" w:color="A6A6A6"/>
+              <w:insideH w:val="single" w:sz="6" w:space="0" w:color="A6A6A6"/>
+              <w:insideV w:val="single" w:sz="6" w:space="0" w:color="A6A6A6"/>
+            </w:tcBorders>
+          </w:tcPr>
+          <w:p>
+            <w:pPr>
+              <w:spacing w:after="0" w:line="240" w:lineRule="auto"/>
+              <w:jc w:val="left"/>
+            </w:pPr>
+            <w:r>
+              <w:rPr>
+                <w:rFonts w:ascii="Arial" w:hAnsi="Arial"/>
+                <w:sz w:val="19"/>
+              </w:rPr>
+            </w:r>
+            <w:r>
+              <w:rPr>
+                <w:rFonts w:ascii="Arial" w:hAnsi="Arial"/>
+                <w:b w:val="0"/>
+                <w:sz w:val="19"/>
+              </w:rPr>
+              <w:t>Theme, colour and interface design evidence</w:t>
+            </w:r>
+          </w:p>
+        </w:tc>
+      </w:tr>
+      <w:tr>
+        <w:tc>
+          <w:tcPr>
+            <w:tcW w:type="dxa" w:w="2880"/>
+            <w:vAlign w:val="center"/>
+            <w:tcBorders>
+              <w:top w:val="single" w:sz="6" w:space="0" w:color="A6A6A6"/>
+              <w:left w:val="single" w:sz="6" w:space="0" w:color="A6A6A6"/>
+              <w:bottom w:val="single" w:sz="6" w:space="0" w:color="A6A6A6"/>
+              <w:right w:val="single" w:sz="6" w:space="0" w:color="A6A6A6"/>
+              <w:insideH w:val="single" w:sz="6" w:space="0" w:color="A6A6A6"/>
+              <w:insideV w:val="single" w:sz="6" w:space="0" w:color="A6A6A6"/>
+            </w:tcBorders>
+          </w:tcPr>
+          <w:p>
+            <w:pPr>
+              <w:spacing w:after="0" w:line="240" w:lineRule="auto"/>
+              <w:jc w:val="left"/>
+            </w:pPr>
+            <w:r>
+              <w:rPr>
+                <w:rFonts w:ascii="Arial" w:hAnsi="Arial"/>
+                <w:sz w:val="19"/>
+              </w:rPr>
+            </w:r>
+            <w:r>
+              <w:rPr>
+                <w:rFonts w:ascii="Arial" w:hAnsi="Arial"/>
+                <w:b w:val="0"/>
+                <w:sz w:val="19"/>
+              </w:rPr>
+              <w:t>Prepare a testing approach</w:t>
+            </w:r>
+          </w:p>
+        </w:tc>
+        <w:tc>
+          <w:tcPr>
+            <w:tcW w:type="dxa" w:w="2376"/>
+            <w:vAlign w:val="center"/>
+            <w:tcBorders>
+              <w:top w:val="single" w:sz="6" w:space="0" w:color="A6A6A6"/>
+              <w:left w:val="single" w:sz="6" w:space="0" w:color="A6A6A6"/>
+              <w:bottom w:val="single" w:sz="6" w:space="0" w:color="A6A6A6"/>
+              <w:right w:val="single" w:sz="6" w:space="0" w:color="A6A6A6"/>
+              <w:insideH w:val="single" w:sz="6" w:space="0" w:color="A6A6A6"/>
+              <w:insideV w:val="single" w:sz="6" w:space="0" w:color="A6A6A6"/>
+            </w:tcBorders>
+          </w:tcPr>
+          <w:p>
+            <w:pPr>
+              <w:spacing w:after="0" w:line="240" w:lineRule="auto"/>
+              <w:jc w:val="left"/>
+            </w:pPr>
+            <w:r>
+              <w:rPr>
+                <w:rFonts w:ascii="Arial" w:hAnsi="Arial"/>
+                <w:sz w:val="19"/>
+              </w:rPr>
+            </w:r>
+            <w:r>
+              <w:rPr>
+                <w:rFonts w:ascii="Arial" w:hAnsi="Arial"/>
+                <w:b w:val="0"/>
+                <w:sz w:val="19"/>
+              </w:rPr>
+              <w:t>Anjila Gurung, Sabina Mahat</w:t>
+            </w:r>
+          </w:p>
+        </w:tc>
+        <w:tc>
+          <w:tcPr>
+            <w:tcW w:type="dxa" w:w="1440"/>
+            <w:vAlign w:val="center"/>
+            <w:tcBorders>
+              <w:top w:val="single" w:sz="6" w:space="0" w:color="A6A6A6"/>
+              <w:left w:val="single" w:sz="6" w:space="0" w:color="A6A6A6"/>
+              <w:bottom w:val="single" w:sz="6" w:space="0" w:color="A6A6A6"/>
+              <w:right w:val="single" w:sz="6" w:space="0" w:color="A6A6A6"/>
+              <w:insideH w:val="single" w:sz="6" w:space="0" w:color="A6A6A6"/>
+              <w:insideV w:val="single" w:sz="6" w:space="0" w:color="A6A6A6"/>
+            </w:tcBorders>
+          </w:tcPr>
+          <w:p>
+            <w:pPr>
+              <w:spacing w:after="0" w:line="240" w:lineRule="auto"/>
+              <w:jc w:val="left"/>
+            </w:pPr>
+            <w:r>
+              <w:rPr>
+                <w:rFonts w:ascii="Arial" w:hAnsi="Arial"/>
+                <w:sz w:val="19"/>
+              </w:rPr>
+            </w:r>
+            <w:r>
+              <w:rPr>
+                <w:rFonts w:ascii="Arial" w:hAnsi="Arial"/>
+                <w:b w:val="0"/>
+                <w:sz w:val="19"/>
+              </w:rPr>
+              <w:t>31/05/2026</w:t>
+            </w:r>
+          </w:p>
+        </w:tc>
+        <w:tc>
+          <w:tcPr>
+            <w:tcW w:type="dxa" w:w="3960"/>
+            <w:vAlign w:val="center"/>
+            <w:tcBorders>
+              <w:top w:val="single" w:sz="6" w:space="0" w:color="A6A6A6"/>
+              <w:left w:val="single" w:sz="6" w:space="0" w:color="A6A6A6"/>
+              <w:bottom w:val="single" w:sz="6" w:space="0" w:color="A6A6A6"/>
+              <w:right w:val="single" w:sz="6" w:space="0" w:color="A6A6A6"/>
+              <w:insideH w:val="single" w:sz="6" w:space="0" w:color="A6A6A6"/>
+              <w:insideV w:val="single" w:sz="6" w:space="0" w:color="A6A6A6"/>
+            </w:tcBorders>
+          </w:tcPr>
+          <w:p>
+            <w:pPr>
+              <w:spacing w:after="0" w:line="240" w:lineRule="auto"/>
+              <w:jc w:val="left"/>
+            </w:pPr>
+            <w:r>
+              <w:rPr>
+                <w:rFonts w:ascii="Arial" w:hAnsi="Arial"/>
+                <w:sz w:val="19"/>
+              </w:rPr>
+            </w:r>
+            <w:r>
+              <w:rPr>
+                <w:rFonts w:ascii="Arial" w:hAnsi="Arial"/>
+                <w:b w:val="0"/>
+                <w:sz w:val="19"/>
+              </w:rPr>
+              <w:t>Testing checklist, feedback questions and bug log template</w:t>
+            </w:r>
+          </w:p>
+        </w:tc>
+      </w:tr>
+    </w:tbl>
+    <w:p>
+      <w:pPr>
+        <w:spacing w:after="120" w:line="259" w:lineRule="auto"/>
+      </w:pPr>
+    </w:p>
+    <w:p>
+      <w:pPr>
+        <w:pStyle w:val="Heading1"/>
+        <w:spacing w:after="80" w:line="259" w:lineRule="auto" w:before="160"/>
+      </w:pPr>
+      <w:r>
+        <w:rPr>
+          <w:rFonts w:ascii="Arial" w:hAnsi="Arial"/>
+          <w:b/>
+          <w:color w:val="1F4E79"/>
+          <w:sz w:val="26"/>
+        </w:rPr>
+        <w:t>7. Risks, Assumptions and Issues</w:t>
+      </w:r>
+    </w:p>
+    <w:p>
+      <w:pPr>
+        <w:pStyle w:val="ListBullet"/>
+        <w:spacing w:after="120" w:line="259" w:lineRule="auto"/>
+      </w:pPr>
+      <w:r>
+        <w:rPr>
+          <w:rFonts w:ascii="Arial" w:hAnsi="Arial"/>
+          <w:sz w:val="21"/>
+        </w:rPr>
+        <w:t>The target audience still needed to be defined clearly so the game content and difficulty could be age-appropriate.</w:t>
+      </w:r>
+    </w:p>
+    <w:p>
+      <w:pPr>
+        <w:pStyle w:val="ListBullet"/>
+        <w:spacing w:after="120" w:line="259" w:lineRule="auto"/>
+      </w:pPr>
+      <w:r>
+        <w:rPr>
+          <w:rFonts w:ascii="Arial" w:hAnsi="Arial"/>
+          <w:sz w:val="21"/>
+        </w:rPr>
+        <w:t>The game concept needed to remain educational and not become only entertainment-focused.</w:t>
+      </w:r>
+    </w:p>
+    <w:p>
+      <w:pPr>
+        <w:pStyle w:val="ListBullet"/>
+        <w:spacing w:after="120" w:line="259" w:lineRule="auto"/>
+      </w:pPr>
+      <w:r>
+        <w:rPr>
+          <w:rFonts w:ascii="Arial" w:hAnsi="Arial"/>
+          <w:sz w:val="21"/>
+        </w:rPr>
+        <w:t>The team needed to collect evidence throughout the project rather than only at the end.</w:t>
+      </w:r>
+    </w:p>
+    <w:p>
+      <w:pPr>
+        <w:pStyle w:val="Heading1"/>
+        <w:spacing w:after="80" w:line="259" w:lineRule="auto" w:before="160"/>
+      </w:pPr>
+      <w:r>
+        <w:rPr>
+          <w:rFonts w:ascii="Arial" w:hAnsi="Arial"/>
+          <w:b/>
+          <w:color w:val="1F4E79"/>
+          <w:sz w:val="26"/>
+        </w:rPr>
+        <w:t>8. Next Steps</w:t>
+      </w:r>
+    </w:p>
+    <w:tbl>
+      <w:tblPr>
+        <w:tblStyle w:val="TableGrid"/>
+        <w:tblW w:type="auto" w:w="0"/>
+        <w:jc w:val="center"/>
+        <w:tblLayout w:type="autofit"/>
+        <w:tblLook w:firstColumn="1" w:firstRow="1" w:lastColumn="0" w:lastRow="0" w:noHBand="0" w:noVBand="1" w:val="04A0"/>
+      </w:tblPr>
+      <w:tblGrid>
+        <w:gridCol w:w="3360"/>
+        <w:gridCol w:w="3360"/>
+        <w:gridCol w:w="3360"/>
+      </w:tblGrid>
+      <w:tr>
+        <w:trPr>
+          <w:tblHeader w:val="true"/>
+        </w:trPr>
+        <w:tc>
+          <w:tcPr>
+            <w:tcW w:type="dxa" w:w="3024"/>
+            <w:vAlign w:val="center"/>
+            <w:shd w:fill="D9EAF7"/>
+            <w:tcBorders>
+              <w:top w:val="single" w:sz="6" w:space="0" w:color="A6A6A6"/>
+              <w:left w:val="single" w:sz="6" w:space="0" w:color="A6A6A6"/>
+              <w:bottom w:val="single" w:sz="6" w:space="0" w:color="A6A6A6"/>
+              <w:right w:val="single" w:sz="6" w:space="0" w:color="A6A6A6"/>
+              <w:insideH w:val="single" w:sz="6" w:space="0" w:color="A6A6A6"/>
+              <w:insideV w:val="single" w:sz="6" w:space="0" w:color="A6A6A6"/>
+            </w:tcBorders>
+          </w:tcPr>
+          <w:p>
+            <w:pPr>
+              <w:spacing w:after="0" w:line="240" w:lineRule="auto"/>
+              <w:jc w:val="left"/>
+            </w:pPr>
+            <w:r>
+              <w:rPr>
+                <w:rFonts w:ascii="Arial" w:hAnsi="Arial"/>
+                <w:b/>
+                <w:sz w:val="19"/>
+              </w:rPr>
+            </w:r>
+            <w:r>
+              <w:rPr>
+                <w:rFonts w:ascii="Arial" w:hAnsi="Arial"/>
+                <w:b/>
+                <w:sz w:val="19"/>
+              </w:rPr>
+              <w:t>Next Step</w:t>
+            </w:r>
+          </w:p>
+        </w:tc>
+        <w:tc>
+          <w:tcPr>
+            <w:tcW w:type="dxa" w:w="1800"/>
+            <w:vAlign w:val="center"/>
+            <w:shd w:fill="D9EAF7"/>
+            <w:tcBorders>
+              <w:top w:val="single" w:sz="6" w:space="0" w:color="A6A6A6"/>
+              <w:left w:val="single" w:sz="6" w:space="0" w:color="A6A6A6"/>
+              <w:bottom w:val="single" w:sz="6" w:space="0" w:color="A6A6A6"/>
+              <w:right w:val="single" w:sz="6" w:space="0" w:color="A6A6A6"/>
+              <w:insideH w:val="single" w:sz="6" w:space="0" w:color="A6A6A6"/>
+              <w:insideV w:val="single" w:sz="6" w:space="0" w:color="A6A6A6"/>
+            </w:tcBorders>
+          </w:tcPr>
+          <w:p>
+            <w:pPr>
+              <w:spacing w:after="0" w:line="240" w:lineRule="auto"/>
+              <w:jc w:val="left"/>
+            </w:pPr>
+            <w:r>
+              <w:rPr>
+                <w:rFonts w:ascii="Arial" w:hAnsi="Arial"/>
+                <w:b/>
+                <w:sz w:val="19"/>
+              </w:rPr>
+            </w:r>
+            <w:r>
+              <w:rPr>
+                <w:rFonts w:ascii="Arial" w:hAnsi="Arial"/>
+                <w:b/>
+                <w:sz w:val="19"/>
+              </w:rPr>
+              <w:t>Date / Deadline</w:t>
+            </w:r>
+          </w:p>
+        </w:tc>
+        <w:tc>
+          <w:tcPr>
+            <w:tcW w:type="dxa" w:w="5832"/>
+            <w:vAlign w:val="center"/>
+            <w:shd w:fill="D9EAF7"/>
+            <w:tcBorders>
+              <w:top w:val="single" w:sz="6" w:space="0" w:color="A6A6A6"/>
+              <w:left w:val="single" w:sz="6" w:space="0" w:color="A6A6A6"/>
+              <w:bottom w:val="single" w:sz="6" w:space="0" w:color="A6A6A6"/>
+              <w:right w:val="single" w:sz="6" w:space="0" w:color="A6A6A6"/>
+              <w:insideH w:val="single" w:sz="6" w:space="0" w:color="A6A6A6"/>
+              <w:insideV w:val="single" w:sz="6" w:space="0" w:color="A6A6A6"/>
+            </w:tcBorders>
+          </w:tcPr>
+          <w:p>
+            <w:pPr>
+              <w:spacing w:after="0" w:line="240" w:lineRule="auto"/>
+              <w:jc w:val="left"/>
+            </w:pPr>
+            <w:r>
+              <w:rPr>
+                <w:rFonts w:ascii="Arial" w:hAnsi="Arial"/>
+                <w:b/>
+                <w:sz w:val="19"/>
+              </w:rPr>
+            </w:r>
+            <w:r>
+              <w:rPr>
+                <w:rFonts w:ascii="Arial" w:hAnsi="Arial"/>
+                <w:b/>
+                <w:sz w:val="19"/>
+              </w:rPr>
+              <w:t>Purpose</w:t>
             </w:r>
           </w:p>
         </w:tc>
@@ -949,79 +2353,101 @@
           <w:tcPr>
             <w:tcW w:type="dxa" w:w="3024"/>
             <w:vAlign w:val="center"/>
+            <w:tcBorders>
+              <w:top w:val="single" w:sz="6" w:space="0" w:color="A6A6A6"/>
+              <w:left w:val="single" w:sz="6" w:space="0" w:color="A6A6A6"/>
+              <w:bottom w:val="single" w:sz="6" w:space="0" w:color="A6A6A6"/>
+              <w:right w:val="single" w:sz="6" w:space="0" w:color="A6A6A6"/>
+              <w:insideH w:val="single" w:sz="6" w:space="0" w:color="A6A6A6"/>
+              <w:insideV w:val="single" w:sz="6" w:space="0" w:color="A6A6A6"/>
+            </w:tcBorders>
           </w:tcPr>
           <w:p>
             <w:pPr>
+              <w:spacing w:after="0" w:line="240" w:lineRule="auto"/>
               <w:jc w:val="left"/>
             </w:pPr>
-            <w:r/>
+            <w:r>
+              <w:rPr>
+                <w:rFonts w:ascii="Arial" w:hAnsi="Arial"/>
+                <w:sz w:val="19"/>
+              </w:rPr>
+            </w:r>
             <w:r>
               <w:rPr>
                 <w:rFonts w:ascii="Arial" w:hAnsi="Arial"/>
                 <w:b w:val="0"/>
-                <w:sz w:val="20"/>
+                <w:sz w:val="19"/>
               </w:rPr>
-              <w:t>Create initial project plan and timeline</w:t>
+              <w:t>Second team meeting</w:t>
             </w:r>
           </w:p>
         </w:tc>
         <w:tc>
           <w:tcPr>
-            <w:tcW w:type="dxa" w:w="2448"/>
+            <w:tcW w:type="dxa" w:w="1800"/>
             <w:vAlign w:val="center"/>
+            <w:tcBorders>
+              <w:top w:val="single" w:sz="6" w:space="0" w:color="A6A6A6"/>
+              <w:left w:val="single" w:sz="6" w:space="0" w:color="A6A6A6"/>
+              <w:bottom w:val="single" w:sz="6" w:space="0" w:color="A6A6A6"/>
+              <w:right w:val="single" w:sz="6" w:space="0" w:color="A6A6A6"/>
+              <w:insideH w:val="single" w:sz="6" w:space="0" w:color="A6A6A6"/>
+              <w:insideV w:val="single" w:sz="6" w:space="0" w:color="A6A6A6"/>
+            </w:tcBorders>
           </w:tcPr>
           <w:p>
             <w:pPr>
+              <w:spacing w:after="0" w:line="240" w:lineRule="auto"/>
               <w:jc w:val="left"/>
             </w:pPr>
-            <w:r/>
+            <w:r>
+              <w:rPr>
+                <w:rFonts w:ascii="Arial" w:hAnsi="Arial"/>
+                <w:sz w:val="19"/>
+              </w:rPr>
+            </w:r>
             <w:r>
               <w:rPr>
                 <w:rFonts w:ascii="Arial" w:hAnsi="Arial"/>
                 <w:b w:val="0"/>
-                <w:sz w:val="20"/>
+                <w:sz w:val="19"/>
               </w:rPr>
-              <w:t>Renita V Kapdiya, Sabina Mahat</w:t>
+              <w:t>26/05/2026</w:t>
             </w:r>
           </w:p>
         </w:tc>
         <w:tc>
           <w:tcPr>
-            <w:tcW w:type="dxa" w:w="1584"/>
+            <w:tcW w:type="dxa" w:w="5832"/>
             <w:vAlign w:val="center"/>
+            <w:tcBorders>
+              <w:top w:val="single" w:sz="6" w:space="0" w:color="A6A6A6"/>
+              <w:left w:val="single" w:sz="6" w:space="0" w:color="A6A6A6"/>
+              <w:bottom w:val="single" w:sz="6" w:space="0" w:color="A6A6A6"/>
+              <w:right w:val="single" w:sz="6" w:space="0" w:color="A6A6A6"/>
+              <w:insideH w:val="single" w:sz="6" w:space="0" w:color="A6A6A6"/>
+              <w:insideV w:val="single" w:sz="6" w:space="0" w:color="A6A6A6"/>
+            </w:tcBorders>
           </w:tcPr>
           <w:p>
             <w:pPr>
+              <w:spacing w:after="0" w:line="240" w:lineRule="auto"/>
               <w:jc w:val="left"/>
             </w:pPr>
-            <w:r/>
+            <w:r>
+              <w:rPr>
+                <w:rFonts w:ascii="Arial" w:hAnsi="Arial"/>
+                <w:sz w:val="19"/>
+              </w:rPr>
+            </w:r>
             <w:r>
               <w:rPr>
                 <w:rFonts w:ascii="Arial" w:hAnsi="Arial"/>
                 <w:b w:val="0"/>
-                <w:sz w:val="20"/>
+                <w:sz w:val="19"/>
               </w:rPr>
-              <w:t>22/05/2026</w:t>
-            </w:r>
-          </w:p>
-        </w:tc>
-        <w:tc>
-          <w:tcPr>
-            <w:tcW w:type="dxa" w:w="3456"/>
-            <w:vAlign w:val="center"/>
-          </w:tcPr>
-          <w:p>
-            <w:pPr>
-              <w:jc w:val="left"/>
-            </w:pPr>
-            <w:r/>
-            <w:r>
-              <w:rPr>
-                <w:rFonts w:ascii="Arial" w:hAnsi="Arial"/>
-                <w:b w:val="0"/>
-                <w:sz w:val="20"/>
-              </w:rPr>
-              <w:t>Planning notes, task list, timeline screenshot/document</w:t>
+              <w:t>Review progress, evaluate the first concept and finalise the game direction.</w:t>
             </w:r>
           </w:p>
         </w:tc>
@@ -1031,79 +2457,101 @@
           <w:tcPr>
             <w:tcW w:type="dxa" w:w="3024"/>
             <w:vAlign w:val="center"/>
+            <w:tcBorders>
+              <w:top w:val="single" w:sz="6" w:space="0" w:color="A6A6A6"/>
+              <w:left w:val="single" w:sz="6" w:space="0" w:color="A6A6A6"/>
+              <w:bottom w:val="single" w:sz="6" w:space="0" w:color="A6A6A6"/>
+              <w:right w:val="single" w:sz="6" w:space="0" w:color="A6A6A6"/>
+              <w:insideH w:val="single" w:sz="6" w:space="0" w:color="A6A6A6"/>
+              <w:insideV w:val="single" w:sz="6" w:space="0" w:color="A6A6A6"/>
+            </w:tcBorders>
           </w:tcPr>
           <w:p>
             <w:pPr>
+              <w:spacing w:after="0" w:line="240" w:lineRule="auto"/>
               <w:jc w:val="left"/>
             </w:pPr>
-            <w:r/>
+            <w:r>
+              <w:rPr>
+                <w:rFonts w:ascii="Arial" w:hAnsi="Arial"/>
+                <w:sz w:val="19"/>
+              </w:rPr>
+            </w:r>
             <w:r>
               <w:rPr>
                 <w:rFonts w:ascii="Arial" w:hAnsi="Arial"/>
                 <w:b w:val="0"/>
-                <w:sz w:val="20"/>
+                <w:sz w:val="19"/>
               </w:rPr>
-              <w:t>Sketch or outline base game layout</w:t>
+              <w:t>Feedback stage</w:t>
             </w:r>
           </w:p>
         </w:tc>
         <w:tc>
           <w:tcPr>
-            <w:tcW w:type="dxa" w:w="2448"/>
+            <w:tcW w:type="dxa" w:w="1800"/>
             <w:vAlign w:val="center"/>
+            <w:tcBorders>
+              <w:top w:val="single" w:sz="6" w:space="0" w:color="A6A6A6"/>
+              <w:left w:val="single" w:sz="6" w:space="0" w:color="A6A6A6"/>
+              <w:bottom w:val="single" w:sz="6" w:space="0" w:color="A6A6A6"/>
+              <w:right w:val="single" w:sz="6" w:space="0" w:color="A6A6A6"/>
+              <w:insideH w:val="single" w:sz="6" w:space="0" w:color="A6A6A6"/>
+              <w:insideV w:val="single" w:sz="6" w:space="0" w:color="A6A6A6"/>
+            </w:tcBorders>
           </w:tcPr>
           <w:p>
             <w:pPr>
+              <w:spacing w:after="0" w:line="240" w:lineRule="auto"/>
               <w:jc w:val="left"/>
             </w:pPr>
-            <w:r/>
+            <w:r>
+              <w:rPr>
+                <w:rFonts w:ascii="Arial" w:hAnsi="Arial"/>
+                <w:sz w:val="19"/>
+              </w:rPr>
+            </w:r>
             <w:r>
               <w:rPr>
                 <w:rFonts w:ascii="Arial" w:hAnsi="Arial"/>
                 <w:b w:val="0"/>
-                <w:sz w:val="20"/>
+                <w:sz w:val="19"/>
               </w:rPr>
-              <w:t>All team members</w:t>
+              <w:t>01/06/2026</w:t>
             </w:r>
           </w:p>
         </w:tc>
         <w:tc>
           <w:tcPr>
-            <w:tcW w:type="dxa" w:w="1584"/>
+            <w:tcW w:type="dxa" w:w="5832"/>
             <w:vAlign w:val="center"/>
+            <w:tcBorders>
+              <w:top w:val="single" w:sz="6" w:space="0" w:color="A6A6A6"/>
+              <w:left w:val="single" w:sz="6" w:space="0" w:color="A6A6A6"/>
+              <w:bottom w:val="single" w:sz="6" w:space="0" w:color="A6A6A6"/>
+              <w:right w:val="single" w:sz="6" w:space="0" w:color="A6A6A6"/>
+              <w:insideH w:val="single" w:sz="6" w:space="0" w:color="A6A6A6"/>
+              <w:insideV w:val="single" w:sz="6" w:space="0" w:color="A6A6A6"/>
+            </w:tcBorders>
           </w:tcPr>
           <w:p>
             <w:pPr>
+              <w:spacing w:after="0" w:line="240" w:lineRule="auto"/>
               <w:jc w:val="left"/>
             </w:pPr>
-            <w:r/>
+            <w:r>
+              <w:rPr>
+                <w:rFonts w:ascii="Arial" w:hAnsi="Arial"/>
+                <w:sz w:val="19"/>
+              </w:rPr>
+            </w:r>
             <w:r>
               <w:rPr>
                 <w:rFonts w:ascii="Arial" w:hAnsi="Arial"/>
                 <w:b w:val="0"/>
-                <w:sz w:val="20"/>
+                <w:sz w:val="19"/>
               </w:rPr>
-              <w:t>22/05/2026</w:t>
-            </w:r>
-          </w:p>
-        </w:tc>
-        <w:tc>
-          <w:tcPr>
-            <w:tcW w:type="dxa" w:w="3456"/>
-            <w:vAlign w:val="center"/>
-          </w:tcPr>
-          <w:p>
-            <w:pPr>
-              <w:jc w:val="left"/>
-            </w:pPr>
-            <w:r/>
-            <w:r>
-              <w:rPr>
-                <w:rFonts w:ascii="Arial" w:hAnsi="Arial"/>
-                <w:b w:val="0"/>
-                <w:sz w:val="20"/>
-              </w:rPr>
-              <w:t>Layout sketch, wireframe, or notes from discussion</w:t>
+              <w:t>Collect early feedback on the prototype and identify improvements.</w:t>
             </w:r>
           </w:p>
         </w:tc>
@@ -1113,524 +2561,31 @@
           <w:tcPr>
             <w:tcW w:type="dxa" w:w="3024"/>
             <w:vAlign w:val="center"/>
+            <w:tcBorders>
+              <w:top w:val="single" w:sz="6" w:space="0" w:color="A6A6A6"/>
+              <w:left w:val="single" w:sz="6" w:space="0" w:color="A6A6A6"/>
+              <w:bottom w:val="single" w:sz="6" w:space="0" w:color="A6A6A6"/>
+              <w:right w:val="single" w:sz="6" w:space="0" w:color="A6A6A6"/>
+              <w:insideH w:val="single" w:sz="6" w:space="0" w:color="A6A6A6"/>
+              <w:insideV w:val="single" w:sz="6" w:space="0" w:color="A6A6A6"/>
+            </w:tcBorders>
           </w:tcPr>
           <w:p>
             <w:pPr>
+              <w:spacing w:after="0" w:line="240" w:lineRule="auto"/>
               <w:jc w:val="left"/>
             </w:pPr>
-            <w:r/>
+            <w:r>
+              <w:rPr>
+                <w:rFonts w:ascii="Arial" w:hAnsi="Arial"/>
+                <w:sz w:val="19"/>
+              </w:rPr>
+            </w:r>
             <w:r>
               <w:rPr>
                 <w:rFonts w:ascii="Arial" w:hAnsi="Arial"/>
                 <w:b w:val="0"/>
-                <w:sz w:val="20"/>
-              </w:rPr>
-              <w:t>Begin programming prototype structure</w:t>
-            </w:r>
-          </w:p>
-        </w:tc>
-        <w:tc>
-          <w:tcPr>
-            <w:tcW w:type="dxa" w:w="2448"/>
-            <w:vAlign w:val="center"/>
-          </w:tcPr>
-          <w:p>
-            <w:pPr>
-              <w:jc w:val="left"/>
-            </w:pPr>
-            <w:r/>
-            <w:r>
-              <w:rPr>
-                <w:rFonts w:ascii="Arial" w:hAnsi="Arial"/>
-                <w:b w:val="0"/>
-                <w:sz w:val="20"/>
-              </w:rPr>
-              <w:t>Richa Sorathiya</w:t>
-            </w:r>
-          </w:p>
-        </w:tc>
-        <w:tc>
-          <w:tcPr>
-            <w:tcW w:type="dxa" w:w="1584"/>
-            <w:vAlign w:val="center"/>
-          </w:tcPr>
-          <w:p>
-            <w:pPr>
-              <w:jc w:val="left"/>
-            </w:pPr>
-            <w:r/>
-            <w:r>
-              <w:rPr>
-                <w:rFonts w:ascii="Arial" w:hAnsi="Arial"/>
-                <w:b w:val="0"/>
-                <w:sz w:val="20"/>
-              </w:rPr>
-              <w:t>26/05/2026</w:t>
-            </w:r>
-          </w:p>
-        </w:tc>
-        <w:tc>
-          <w:tcPr>
-            <w:tcW w:type="dxa" w:w="3456"/>
-            <w:vAlign w:val="center"/>
-          </w:tcPr>
-          <w:p>
-            <w:pPr>
-              <w:jc w:val="left"/>
-            </w:pPr>
-            <w:r/>
-            <w:r>
-              <w:rPr>
-                <w:rFonts w:ascii="Arial" w:hAnsi="Arial"/>
-                <w:b w:val="0"/>
-                <w:sz w:val="20"/>
-              </w:rPr>
-              <w:t>HTML/CSS/JavaScript file, GitHub commits, screenshots</w:t>
-            </w:r>
-          </w:p>
-        </w:tc>
-      </w:tr>
-      <w:tr>
-        <w:tc>
-          <w:tcPr>
-            <w:tcW w:type="dxa" w:w="3024"/>
-            <w:vAlign w:val="center"/>
-          </w:tcPr>
-          <w:p>
-            <w:pPr>
-              <w:jc w:val="left"/>
-            </w:pPr>
-            <w:r/>
-            <w:r>
-              <w:rPr>
-                <w:rFonts w:ascii="Arial" w:hAnsi="Arial"/>
-                <w:b w:val="0"/>
-                <w:sz w:val="20"/>
-              </w:rPr>
-              <w:t>Develop visual design ideas</w:t>
-            </w:r>
-          </w:p>
-        </w:tc>
-        <w:tc>
-          <w:tcPr>
-            <w:tcW w:type="dxa" w:w="2448"/>
-            <w:vAlign w:val="center"/>
-          </w:tcPr>
-          <w:p>
-            <w:pPr>
-              <w:jc w:val="left"/>
-            </w:pPr>
-            <w:r/>
-            <w:r>
-              <w:rPr>
-                <w:rFonts w:ascii="Arial" w:hAnsi="Arial"/>
-                <w:b w:val="0"/>
-                <w:sz w:val="20"/>
-              </w:rPr>
-              <w:t>Kaberi Shrestha</w:t>
-            </w:r>
-          </w:p>
-        </w:tc>
-        <w:tc>
-          <w:tcPr>
-            <w:tcW w:type="dxa" w:w="1584"/>
-            <w:vAlign w:val="center"/>
-          </w:tcPr>
-          <w:p>
-            <w:pPr>
-              <w:jc w:val="left"/>
-            </w:pPr>
-            <w:r/>
-            <w:r>
-              <w:rPr>
-                <w:rFonts w:ascii="Arial" w:hAnsi="Arial"/>
-                <w:b w:val="0"/>
-                <w:sz w:val="20"/>
-              </w:rPr>
-              <w:t>29/05/2026</w:t>
-            </w:r>
-          </w:p>
-        </w:tc>
-        <w:tc>
-          <w:tcPr>
-            <w:tcW w:type="dxa" w:w="3456"/>
-            <w:vAlign w:val="center"/>
-          </w:tcPr>
-          <w:p>
-            <w:pPr>
-              <w:jc w:val="left"/>
-            </w:pPr>
-            <w:r/>
-            <w:r>
-              <w:rPr>
-                <w:rFonts w:ascii="Arial" w:hAnsi="Arial"/>
-                <w:b w:val="0"/>
-                <w:sz w:val="20"/>
-              </w:rPr>
-              <w:t>Colour/theme ideas, interface sketches, asset notes</w:t>
-            </w:r>
-          </w:p>
-        </w:tc>
-      </w:tr>
-      <w:tr>
-        <w:tc>
-          <w:tcPr>
-            <w:tcW w:type="dxa" w:w="3024"/>
-            <w:vAlign w:val="center"/>
-          </w:tcPr>
-          <w:p>
-            <w:pPr>
-              <w:jc w:val="left"/>
-            </w:pPr>
-            <w:r/>
-            <w:r>
-              <w:rPr>
-                <w:rFonts w:ascii="Arial" w:hAnsi="Arial"/>
-                <w:b w:val="0"/>
-                <w:sz w:val="20"/>
-              </w:rPr>
-              <w:t>Prepare testing approach and feedback questions</w:t>
-            </w:r>
-          </w:p>
-        </w:tc>
-        <w:tc>
-          <w:tcPr>
-            <w:tcW w:type="dxa" w:w="2448"/>
-            <w:vAlign w:val="center"/>
-          </w:tcPr>
-          <w:p>
-            <w:pPr>
-              <w:jc w:val="left"/>
-            </w:pPr>
-            <w:r/>
-            <w:r>
-              <w:rPr>
-                <w:rFonts w:ascii="Arial" w:hAnsi="Arial"/>
-                <w:b w:val="0"/>
-                <w:sz w:val="20"/>
-              </w:rPr>
-              <w:t>Anjila Gurung, Sabina Mahat</w:t>
-            </w:r>
-          </w:p>
-        </w:tc>
-        <w:tc>
-          <w:tcPr>
-            <w:tcW w:type="dxa" w:w="1584"/>
-            <w:vAlign w:val="center"/>
-          </w:tcPr>
-          <w:p>
-            <w:pPr>
-              <w:jc w:val="left"/>
-            </w:pPr>
-            <w:r/>
-            <w:r>
-              <w:rPr>
-                <w:rFonts w:ascii="Arial" w:hAnsi="Arial"/>
-                <w:b w:val="0"/>
-                <w:sz w:val="20"/>
-              </w:rPr>
-              <w:t>31/05/2026</w:t>
-            </w:r>
-          </w:p>
-        </w:tc>
-        <w:tc>
-          <w:tcPr>
-            <w:tcW w:type="dxa" w:w="3456"/>
-            <w:vAlign w:val="center"/>
-          </w:tcPr>
-          <w:p>
-            <w:pPr>
-              <w:jc w:val="left"/>
-            </w:pPr>
-            <w:r/>
-            <w:r>
-              <w:rPr>
-                <w:rFonts w:ascii="Arial" w:hAnsi="Arial"/>
-                <w:b w:val="0"/>
-                <w:sz w:val="20"/>
-              </w:rPr>
-              <w:t>Test checklist, feedback form, bug log</w:t>
-            </w:r>
-          </w:p>
-        </w:tc>
-      </w:tr>
-    </w:tbl>
-    <w:p/>
-    <w:p>
-      <w:pPr>
-        <w:pStyle w:val="Heading1"/>
-      </w:pPr>
-      <w:r>
-        <w:rPr>
-          <w:rFonts w:ascii="Arial" w:hAnsi="Arial"/>
-        </w:rPr>
-        <w:t>Risks / Issues Noted</w:t>
-      </w:r>
-    </w:p>
-    <w:p>
-      <w:pPr>
-        <w:pStyle w:val="ListBullet"/>
-      </w:pPr>
-      <w:r>
-        <w:rPr>
-          <w:rFonts w:ascii="Arial" w:hAnsi="Arial"/>
-          <w:sz w:val="21"/>
-        </w:rPr>
-        <w:t>The game idea must remain clearly linked to cyber-security or digital safety, not only general entertainment.</w:t>
-      </w:r>
-    </w:p>
-    <w:p>
-      <w:pPr>
-        <w:pStyle w:val="ListBullet"/>
-      </w:pPr>
-      <w:r>
-        <w:rPr>
-          <w:rFonts w:ascii="Arial" w:hAnsi="Arial"/>
-          <w:sz w:val="21"/>
-        </w:rPr>
-        <w:t>The team needs to define the target audience clearly in a later meeting so the content and difficulty are age-appropriate.</w:t>
-      </w:r>
-    </w:p>
-    <w:p>
-      <w:pPr>
-        <w:pStyle w:val="ListBullet"/>
-      </w:pPr>
-      <w:r>
-        <w:rPr>
-          <w:rFonts w:ascii="Arial" w:hAnsi="Arial"/>
-          <w:sz w:val="21"/>
-        </w:rPr>
-        <w:t>Evidence must be collected throughout the project because the portfolio requires proof of planning, communication, and individual contribution.</w:t>
-      </w:r>
-    </w:p>
-    <w:p>
-      <w:pPr>
-        <w:pStyle w:val="Heading1"/>
-      </w:pPr>
-      <w:r>
-        <w:rPr>
-          <w:rFonts w:ascii="Arial" w:hAnsi="Arial"/>
-        </w:rPr>
-        <w:t>Next Steps / Next Meeting</w:t>
-      </w:r>
-    </w:p>
-    <w:tbl>
-      <w:tblPr>
-        <w:tblStyle w:val="TableGrid"/>
-        <w:tblW w:type="auto" w:w="0"/>
-        <w:jc w:val="center"/>
-        <w:tblLook w:firstColumn="1" w:firstRow="1" w:lastColumn="0" w:lastRow="0" w:noHBand="0" w:noVBand="1" w:val="04A0"/>
-      </w:tblPr>
-      <w:tblGrid>
-        <w:gridCol w:w="3312"/>
-        <w:gridCol w:w="3312"/>
-        <w:gridCol w:w="3312"/>
-      </w:tblGrid>
-      <w:tr>
-        <w:tc>
-          <w:tcPr>
-            <w:tcW w:type="dxa" w:w="2880"/>
-            <w:vAlign w:val="center"/>
-            <w:shd w:fill="D9EAF7"/>
-          </w:tcPr>
-          <w:p>
-            <w:pPr>
-              <w:jc w:val="left"/>
-            </w:pPr>
-            <w:r/>
-            <w:r>
-              <w:rPr>
-                <w:rFonts w:ascii="Arial" w:hAnsi="Arial"/>
-                <w:b/>
-                <w:sz w:val="20"/>
-              </w:rPr>
-              <w:t>Next Step</w:t>
-            </w:r>
-          </w:p>
-        </w:tc>
-        <w:tc>
-          <w:tcPr>
-            <w:tcW w:type="dxa" w:w="1872"/>
-            <w:vAlign w:val="center"/>
-            <w:shd w:fill="D9EAF7"/>
-          </w:tcPr>
-          <w:p>
-            <w:pPr>
-              <w:jc w:val="left"/>
-            </w:pPr>
-            <w:r/>
-            <w:r>
-              <w:rPr>
-                <w:rFonts w:ascii="Arial" w:hAnsi="Arial"/>
-                <w:b/>
-                <w:sz w:val="20"/>
-              </w:rPr>
-              <w:t>Planned Date</w:t>
-            </w:r>
-          </w:p>
-        </w:tc>
-        <w:tc>
-          <w:tcPr>
-            <w:tcW w:type="dxa" w:w="5760"/>
-            <w:vAlign w:val="center"/>
-            <w:shd w:fill="D9EAF7"/>
-          </w:tcPr>
-          <w:p>
-            <w:pPr>
-              <w:jc w:val="left"/>
-            </w:pPr>
-            <w:r/>
-            <w:r>
-              <w:rPr>
-                <w:rFonts w:ascii="Arial" w:hAnsi="Arial"/>
-                <w:b/>
-                <w:sz w:val="20"/>
-              </w:rPr>
-              <w:t>Purpose</w:t>
-            </w:r>
-          </w:p>
-        </w:tc>
-      </w:tr>
-      <w:tr>
-        <w:tc>
-          <w:tcPr>
-            <w:tcW w:type="dxa" w:w="2880"/>
-            <w:vAlign w:val="center"/>
-          </w:tcPr>
-          <w:p>
-            <w:pPr>
-              <w:jc w:val="left"/>
-            </w:pPr>
-            <w:r/>
-            <w:r>
-              <w:rPr>
-                <w:rFonts w:ascii="Arial" w:hAnsi="Arial"/>
-                <w:b w:val="0"/>
-                <w:sz w:val="20"/>
-              </w:rPr>
-              <w:t>Second team meeting</w:t>
-            </w:r>
-          </w:p>
-        </w:tc>
-        <w:tc>
-          <w:tcPr>
-            <w:tcW w:type="dxa" w:w="1872"/>
-            <w:vAlign w:val="center"/>
-          </w:tcPr>
-          <w:p>
-            <w:pPr>
-              <w:jc w:val="left"/>
-            </w:pPr>
-            <w:r/>
-            <w:r>
-              <w:rPr>
-                <w:rFonts w:ascii="Arial" w:hAnsi="Arial"/>
-                <w:b w:val="0"/>
-                <w:sz w:val="20"/>
-              </w:rPr>
-              <w:t>26/05/2026</w:t>
-            </w:r>
-          </w:p>
-        </w:tc>
-        <w:tc>
-          <w:tcPr>
-            <w:tcW w:type="dxa" w:w="5760"/>
-            <w:vAlign w:val="center"/>
-          </w:tcPr>
-          <w:p>
-            <w:pPr>
-              <w:jc w:val="left"/>
-            </w:pPr>
-            <w:r/>
-            <w:r>
-              <w:rPr>
-                <w:rFonts w:ascii="Arial" w:hAnsi="Arial"/>
-                <w:b w:val="0"/>
-                <w:sz w:val="20"/>
-              </w:rPr>
-              <w:t>Review progress, confirm or revise the game idea, and finalise the feature list.</w:t>
-            </w:r>
-          </w:p>
-        </w:tc>
-      </w:tr>
-      <w:tr>
-        <w:tc>
-          <w:tcPr>
-            <w:tcW w:type="dxa" w:w="2880"/>
-            <w:vAlign w:val="center"/>
-          </w:tcPr>
-          <w:p>
-            <w:pPr>
-              <w:jc w:val="left"/>
-            </w:pPr>
-            <w:r/>
-            <w:r>
-              <w:rPr>
-                <w:rFonts w:ascii="Arial" w:hAnsi="Arial"/>
-                <w:b w:val="0"/>
-                <w:sz w:val="20"/>
-              </w:rPr>
-              <w:t>Feedback stage</w:t>
-            </w:r>
-          </w:p>
-        </w:tc>
-        <w:tc>
-          <w:tcPr>
-            <w:tcW w:type="dxa" w:w="1872"/>
-            <w:vAlign w:val="center"/>
-          </w:tcPr>
-          <w:p>
-            <w:pPr>
-              <w:jc w:val="left"/>
-            </w:pPr>
-            <w:r/>
-            <w:r>
-              <w:rPr>
-                <w:rFonts w:ascii="Arial" w:hAnsi="Arial"/>
-                <w:b w:val="0"/>
-                <w:sz w:val="20"/>
-              </w:rPr>
-              <w:t>01/06/2026</w:t>
-            </w:r>
-          </w:p>
-        </w:tc>
-        <w:tc>
-          <w:tcPr>
-            <w:tcW w:type="dxa" w:w="5760"/>
-            <w:vAlign w:val="center"/>
-          </w:tcPr>
-          <w:p>
-            <w:pPr>
-              <w:jc w:val="left"/>
-            </w:pPr>
-            <w:r/>
-            <w:r>
-              <w:rPr>
-                <w:rFonts w:ascii="Arial" w:hAnsi="Arial"/>
-                <w:b w:val="0"/>
-                <w:sz w:val="20"/>
-              </w:rPr>
-              <w:t>Collect early feedback on the prototype and identify improvements.</w:t>
-            </w:r>
-          </w:p>
-        </w:tc>
-      </w:tr>
-      <w:tr>
-        <w:tc>
-          <w:tcPr>
-            <w:tcW w:type="dxa" w:w="2880"/>
-            <w:vAlign w:val="center"/>
-          </w:tcPr>
-          <w:p>
-            <w:pPr>
-              <w:jc w:val="left"/>
-            </w:pPr>
-            <w:r/>
-            <w:r>
-              <w:rPr>
-                <w:rFonts w:ascii="Arial" w:hAnsi="Arial"/>
-                <w:b w:val="0"/>
-                <w:sz w:val="20"/>
+                <w:sz w:val="19"/>
               </w:rPr>
               <w:t>Improvement stage</w:t>
             </w:r>
@@ -1638,19 +2593,33 @@
         </w:tc>
         <w:tc>
           <w:tcPr>
-            <w:tcW w:type="dxa" w:w="1872"/>
+            <w:tcW w:type="dxa" w:w="1800"/>
             <w:vAlign w:val="center"/>
+            <w:tcBorders>
+              <w:top w:val="single" w:sz="6" w:space="0" w:color="A6A6A6"/>
+              <w:left w:val="single" w:sz="6" w:space="0" w:color="A6A6A6"/>
+              <w:bottom w:val="single" w:sz="6" w:space="0" w:color="A6A6A6"/>
+              <w:right w:val="single" w:sz="6" w:space="0" w:color="A6A6A6"/>
+              <w:insideH w:val="single" w:sz="6" w:space="0" w:color="A6A6A6"/>
+              <w:insideV w:val="single" w:sz="6" w:space="0" w:color="A6A6A6"/>
+            </w:tcBorders>
           </w:tcPr>
           <w:p>
             <w:pPr>
+              <w:spacing w:after="0" w:line="240" w:lineRule="auto"/>
               <w:jc w:val="left"/>
             </w:pPr>
-            <w:r/>
+            <w:r>
+              <w:rPr>
+                <w:rFonts w:ascii="Arial" w:hAnsi="Arial"/>
+                <w:sz w:val="19"/>
+              </w:rPr>
+            </w:r>
             <w:r>
               <w:rPr>
                 <w:rFonts w:ascii="Arial" w:hAnsi="Arial"/>
                 <w:b w:val="0"/>
-                <w:sz w:val="20"/>
+                <w:sz w:val="19"/>
               </w:rPr>
               <w:t>02/06/2026</w:t>
             </w:r>
@@ -1658,90 +2627,116 @@
         </w:tc>
         <w:tc>
           <w:tcPr>
-            <w:tcW w:type="dxa" w:w="5760"/>
+            <w:tcW w:type="dxa" w:w="5832"/>
             <w:vAlign w:val="center"/>
+            <w:tcBorders>
+              <w:top w:val="single" w:sz="6" w:space="0" w:color="A6A6A6"/>
+              <w:left w:val="single" w:sz="6" w:space="0" w:color="A6A6A6"/>
+              <w:bottom w:val="single" w:sz="6" w:space="0" w:color="A6A6A6"/>
+              <w:right w:val="single" w:sz="6" w:space="0" w:color="A6A6A6"/>
+              <w:insideH w:val="single" w:sz="6" w:space="0" w:color="A6A6A6"/>
+              <w:insideV w:val="single" w:sz="6" w:space="0" w:color="A6A6A6"/>
+            </w:tcBorders>
           </w:tcPr>
           <w:p>
             <w:pPr>
+              <w:spacing w:after="0" w:line="240" w:lineRule="auto"/>
               <w:jc w:val="left"/>
             </w:pPr>
-            <w:r/>
+            <w:r>
+              <w:rPr>
+                <w:rFonts w:ascii="Arial" w:hAnsi="Arial"/>
+                <w:sz w:val="19"/>
+              </w:rPr>
+            </w:r>
             <w:r>
               <w:rPr>
                 <w:rFonts w:ascii="Arial" w:hAnsi="Arial"/>
                 <w:b w:val="0"/>
-                <w:sz w:val="20"/>
+                <w:sz w:val="19"/>
               </w:rPr>
-              <w:t>Apply feedback and improve the prototype/documentation.</w:t>
+              <w:t>Apply feedback and update the game and documentation.</w:t>
             </w:r>
           </w:p>
         </w:tc>
       </w:tr>
     </w:tbl>
-    <w:p/>
+    <w:p>
+      <w:pPr>
+        <w:spacing w:after="120" w:line="259" w:lineRule="auto"/>
+      </w:pPr>
+    </w:p>
     <w:p>
       <w:pPr>
         <w:pStyle w:val="Heading1"/>
+        <w:spacing w:after="80" w:line="259" w:lineRule="auto" w:before="160"/>
       </w:pPr>
       <w:r>
         <w:rPr>
           <w:rFonts w:ascii="Arial" w:hAnsi="Arial"/>
+          <w:b/>
+          <w:color w:val="1F4E79"/>
+          <w:sz w:val="26"/>
         </w:rPr>
-        <w:t>Portfolio Evidence Created by This Meeting</w:t>
+        <w:t>9. Portfolio Evidence Generated</w:t>
       </w:r>
     </w:p>
     <w:p>
       <w:pPr>
         <w:pStyle w:val="ListBullet"/>
+        <w:spacing w:after="120" w:line="259" w:lineRule="auto"/>
       </w:pPr>
       <w:r>
         <w:rPr>
           <w:rFonts w:ascii="Arial" w:hAnsi="Arial"/>
           <w:sz w:val="21"/>
         </w:rPr>
-        <w:t>Meeting minutes showing early planning and communication.</w:t>
+        <w:t>Formal minutes showing early planning and communication.</w:t>
       </w:r>
     </w:p>
     <w:p>
       <w:pPr>
         <w:pStyle w:val="ListBullet"/>
+        <w:spacing w:after="120" w:line="259" w:lineRule="auto"/>
       </w:pPr>
       <w:r>
         <w:rPr>
           <w:rFonts w:ascii="Arial" w:hAnsi="Arial"/>
           <w:sz w:val="21"/>
         </w:rPr>
-        <w:t>Task allocation showing each member’s planned contribution.</w:t>
+        <w:t>Initial decision-making evidence linked to the client brief.</w:t>
       </w:r>
     </w:p>
     <w:p>
       <w:pPr>
         <w:pStyle w:val="ListBullet"/>
+        <w:spacing w:after="120" w:line="259" w:lineRule="auto"/>
       </w:pPr>
       <w:r>
         <w:rPr>
           <w:rFonts w:ascii="Arial" w:hAnsi="Arial"/>
           <w:sz w:val="21"/>
         </w:rPr>
-        <w:t>Decision-making evidence showing how the team responded to the client brief.</w:t>
+        <w:t>Action allocation showing planned individual and group contributions.</w:t>
       </w:r>
     </w:p>
     <w:p>
       <w:pPr>
         <w:pStyle w:val="ListBullet"/>
+        <w:spacing w:after="120" w:line="259" w:lineRule="auto"/>
       </w:pPr>
       <w:r>
         <w:rPr>
           <w:rFonts w:ascii="Arial" w:hAnsi="Arial"/>
           <w:sz w:val="21"/>
         </w:rPr>
-        <w:t>Initial timeline evidence for the individual portfolio appendix.</w:t>
+        <w:t>Evidence that the team considered assessment requirements at the start of the project.</w:t>
       </w:r>
     </w:p>
     <w:sectPr>
       <w:footerReference w:type="default" r:id="rId9"/>
       <w:pgSz w:w="12240" w:h="15840"/>
-      <w:pgMar w:top="1152" w:right="1152" w:bottom="1152" w:left="1152" w:header="720" w:footer="720" w:gutter="0"/>
+      <w:pgMar w:top="1080" w:right="1080" w:bottom="1080" w:left="1080" w:header="720" w:footer="720" w:gutter="0"/>
       <w:cols w:space="720"/>
       <w:docGrid w:linePitch="360"/>
     </w:sectPr>
@@ -1761,7 +2756,7 @@
         <w:rFonts w:ascii="Arial" w:hAnsi="Arial"/>
         <w:sz w:val="16"/>
       </w:rPr>
-      <w:t>503IT Communication and Collaboration | Meeting 1 Minutes</w:t>
+      <w:t>503IT Communication and Collaboration | Academic Meeting Minutes</w:t>
     </w:r>
   </w:p>
 </w:ftr>
@@ -2197,7 +3192,7 @@
       <w:rFonts w:asciiTheme="majorHAnsi" w:eastAsiaTheme="majorEastAsia" w:hAnsiTheme="majorHAnsi" w:cstheme="majorBidi" w:ascii="Arial" w:hAnsi="Arial"/>
       <w:b/>
       <w:bCs/>
-      <w:color w:val="365F91" w:themeColor="accent1" w:themeShade="BF"/>
+      <w:color w:val="1F4E79"/>
       <w:sz w:val="28"/>
       <w:szCs w:val="28"/>
     </w:rPr>
@@ -2221,7 +3216,7 @@
       <w:rFonts w:asciiTheme="majorHAnsi" w:eastAsiaTheme="majorEastAsia" w:hAnsiTheme="majorHAnsi" w:cstheme="majorBidi" w:ascii="Arial" w:hAnsi="Arial"/>
       <w:b/>
       <w:bCs/>
-      <w:color w:val="4F81BD" w:themeColor="accent1"/>
+      <w:color w:val="1F4E79"/>
       <w:sz w:val="26"/>
       <w:szCs w:val="26"/>
     </w:rPr>

</xml_diff>